<commit_message>
Added chapter 7 Structure
</commit_message>
<xml_diff>
--- a/Evaluation MA.docx
+++ b/Evaluation MA.docx
@@ -7,18 +7,28 @@
         <w:rPr>
           <w:b/>
           <w:bCs/>
+          <w:lang w:val="en-US"/>
         </w:rPr>
       </w:pPr>
       <w:r>
         <w:rPr>
           <w:b/>
           <w:bCs/>
+          <w:lang w:val="en-US"/>
         </w:rPr>
         <w:t>Evaluation MA - August 07</w:t>
       </w:r>
     </w:p>
     <w:p>
-      <w:r>
+      <w:pPr>
+        <w:rPr>
+          <w:lang w:val="en-US"/>
+        </w:rPr>
+      </w:pPr>
+      <w:r>
+        <w:rPr>
+          <w:lang w:val="en-US"/>
+        </w:rPr>
         <w:br/>
       </w:r>
       <w:hyperlink r:id="rId4" w:tgtFrame="_blank" w:history="1">
@@ -27,11 +37,15 @@
             <w:rStyle w:val="Hyperlink"/>
             <w:b/>
             <w:bCs/>
+            <w:lang w:val="en-US"/>
           </w:rPr>
           <w:t>VIEW RECORDING - 68 mins (No highlights)</w:t>
         </w:r>
       </w:hyperlink>
       <w:r>
+        <w:rPr>
+          <w:lang w:val="en-US"/>
+        </w:rPr>
         <w:br/>
       </w:r>
     </w:p>
@@ -52,12 +66,36 @@
           <w:b/>
           <w:bCs/>
         </w:rPr>
-        <w:t>Torben Dörrer (Unverified)</w:t>
-      </w:r>
-    </w:p>
-    <w:p>
-      <w:r>
-        <w:t>Ja, okay, jetzt habe ich da heute quasi so einen Bot dran, der nimmt das dann alles mit auf. Sowieso erst einmal jetzt die Frage zu Beginn, ob das okay ist, wenn ich das wieder aufzeichne, damit ich dann im Nachhinein deine ganzen Zitate auswerten kann.</w:t>
+        <w:t>Torben Dörrer (</w:t>
+      </w:r>
+      <w:proofErr w:type="spellStart"/>
+      <w:r>
+        <w:rPr>
+          <w:b/>
+          <w:bCs/>
+        </w:rPr>
+        <w:t>Unverified</w:t>
+      </w:r>
+      <w:proofErr w:type="spellEnd"/>
+      <w:r>
+        <w:rPr>
+          <w:b/>
+          <w:bCs/>
+        </w:rPr>
+        <w:t>)</w:t>
+      </w:r>
+    </w:p>
+    <w:p>
+      <w:r>
+        <w:t xml:space="preserve">Ja, okay, jetzt habe ich da </w:t>
+      </w:r>
+      <w:proofErr w:type="gramStart"/>
+      <w:r>
+        <w:t>heute quasi</w:t>
+      </w:r>
+      <w:proofErr w:type="gramEnd"/>
+      <w:r>
+        <w:t xml:space="preserve"> so einen Bot dran, der nimmt das dann alles mit auf. Sowieso erst einmal jetzt die Frage zu Beginn, ob das okay ist, wenn ich das wieder aufzeichne, damit ich dann im Nachhinein deine ganzen Zitate auswerten kann.</w:t>
       </w:r>
     </w:p>
     <w:p>
@@ -83,7 +121,23 @@
           <w:b/>
           <w:bCs/>
         </w:rPr>
-        <w:t>Tobi Meyer (msg)</w:t>
+        <w:t>Tobi Meyer (</w:t>
+      </w:r>
+      <w:proofErr w:type="spellStart"/>
+      <w:r>
+        <w:rPr>
+          <w:b/>
+          <w:bCs/>
+        </w:rPr>
+        <w:t>msg</w:t>
+      </w:r>
+      <w:proofErr w:type="spellEnd"/>
+      <w:r>
+        <w:rPr>
+          <w:b/>
+          <w:bCs/>
+        </w:rPr>
+        <w:t>)</w:t>
       </w:r>
     </w:p>
     <w:p>
@@ -109,7 +163,23 @@
           <w:b/>
           <w:bCs/>
         </w:rPr>
-        <w:t>Torben Dörrer (Unverified)</w:t>
+        <w:t>Torben Dörrer (</w:t>
+      </w:r>
+      <w:proofErr w:type="spellStart"/>
+      <w:r>
+        <w:rPr>
+          <w:b/>
+          <w:bCs/>
+        </w:rPr>
+        <w:t>Unverified</w:t>
+      </w:r>
+      <w:proofErr w:type="spellEnd"/>
+      <w:r>
+        <w:rPr>
+          <w:b/>
+          <w:bCs/>
+        </w:rPr>
+        <w:t>)</w:t>
       </w:r>
     </w:p>
     <w:p>
@@ -135,12 +205,36 @@
           <w:b/>
           <w:bCs/>
         </w:rPr>
-        <w:t>Tobi Meyer (msg)</w:t>
-      </w:r>
-    </w:p>
-    <w:p>
-      <w:r>
-        <w:t>Ich habe es noch nicht getestet, aber ich habe so dieses Verzeichnis, genau, da sind fünf Excel drin und fünf Chasen, ja.</w:t>
+        <w:t>Tobi Meyer (</w:t>
+      </w:r>
+      <w:proofErr w:type="spellStart"/>
+      <w:r>
+        <w:rPr>
+          <w:b/>
+          <w:bCs/>
+        </w:rPr>
+        <w:t>msg</w:t>
+      </w:r>
+      <w:proofErr w:type="spellEnd"/>
+      <w:r>
+        <w:rPr>
+          <w:b/>
+          <w:bCs/>
+        </w:rPr>
+        <w:t>)</w:t>
+      </w:r>
+    </w:p>
+    <w:p>
+      <w:r>
+        <w:t xml:space="preserve">Ich habe es noch nicht getestet, aber ich habe so dieses Verzeichnis, genau, da sind fünf Excel drin und fünf </w:t>
+      </w:r>
+      <w:proofErr w:type="spellStart"/>
+      <w:r>
+        <w:t>json</w:t>
+      </w:r>
+      <w:proofErr w:type="spellEnd"/>
+      <w:r>
+        <w:t>, ja.</w:t>
       </w:r>
     </w:p>
     <w:p/>
@@ -161,7 +255,23 @@
           <w:b/>
           <w:bCs/>
         </w:rPr>
-        <w:t>Torben Dörrer (Unverified)</w:t>
+        <w:t>Torben Dörrer (</w:t>
+      </w:r>
+      <w:proofErr w:type="spellStart"/>
+      <w:r>
+        <w:rPr>
+          <w:b/>
+          <w:bCs/>
+        </w:rPr>
+        <w:t>Unverified</w:t>
+      </w:r>
+      <w:proofErr w:type="spellEnd"/>
+      <w:r>
+        <w:rPr>
+          <w:b/>
+          <w:bCs/>
+        </w:rPr>
+        <w:t>)</w:t>
       </w:r>
     </w:p>
     <w:p>
@@ -171,7 +281,15 @@
     </w:p>
     <w:p>
       <w:r>
-        <w:t>Ach ja, es wäre wahrscheinlich wichtig, wenn wir Hochdeutsch reden, für die Transkription. Genau, also, dann ganz kurz, also wir machen heute ein sogenanntes Think-Aloud-Verfahren, ja.</w:t>
+        <w:t>Ach ja, es wäre wahrscheinlich wichtig, wenn wir Hochdeutsch reden, für die Transkription. Genau, also, dann ganz kurz, also wir machen heute ein sogenanntes Think-</w:t>
+      </w:r>
+      <w:proofErr w:type="spellStart"/>
+      <w:r>
+        <w:t>Aloud</w:t>
+      </w:r>
+      <w:proofErr w:type="spellEnd"/>
+      <w:r>
+        <w:t>-Verfahren, ja.</w:t>
       </w:r>
     </w:p>
     <w:p>
@@ -181,11 +299,35 @@
     </w:p>
     <w:p>
       <w:r>
-        <w:t xml:space="preserve">Okay. Okay. Im Vergleich mit den Chasens, du kannst es ja auch wahrscheinlich relativ gut erstmal einordnen, du hast ja schon öfter sowas angeschaut und deine Aufgabe ist jetzt dann einfach alles laut auszusprechen, was dir so durch den Kopf geht, während du </w:t>
+        <w:t xml:space="preserve">Okay. Okay. Im Vergleich mit den </w:t>
+      </w:r>
+      <w:proofErr w:type="spellStart"/>
+      <w:r>
+        <w:t>Chasens</w:t>
+      </w:r>
+      <w:proofErr w:type="spellEnd"/>
+      <w:r>
+        <w:t xml:space="preserve">, du kannst es ja auch </w:t>
+      </w:r>
+      <w:proofErr w:type="gramStart"/>
+      <w:r>
+        <w:t>wahrscheinlich relativ</w:t>
+      </w:r>
+      <w:proofErr w:type="gramEnd"/>
+      <w:r>
+        <w:t xml:space="preserve"> gut erstmal einordnen, du hast ja schon öfter sowas angeschaut und deine Aufgabe ist jetzt dann einfach alles laut auszusprechen, was dir so durch den Kopf geht, während du </w:t>
       </w:r>
       <w:r>
         <w:lastRenderedPageBreak/>
-        <w:t>diese Excel-Dashboards liest und während du die Chasens liest und wichtig, ich bin heute nur ein neutraler Beobachter.</w:t>
+        <w:t xml:space="preserve">diese Excel-Dashboards liest und während du die </w:t>
+      </w:r>
+      <w:proofErr w:type="spellStart"/>
+      <w:r>
+        <w:t>Chasens</w:t>
+      </w:r>
+      <w:proofErr w:type="spellEnd"/>
+      <w:r>
+        <w:t xml:space="preserve"> liest und wichtig, ich bin heute nur ein neutraler Beobachter.</w:t>
       </w:r>
     </w:p>
     <w:p>
@@ -221,7 +363,23 @@
           <w:b/>
           <w:bCs/>
         </w:rPr>
-        <w:t>Tobi Meyer (msg)</w:t>
+        <w:t>Tobi Meyer (</w:t>
+      </w:r>
+      <w:proofErr w:type="spellStart"/>
+      <w:r>
+        <w:rPr>
+          <w:b/>
+          <w:bCs/>
+        </w:rPr>
+        <w:t>msg</w:t>
+      </w:r>
+      <w:proofErr w:type="spellEnd"/>
+      <w:r>
+        <w:rPr>
+          <w:b/>
+          <w:bCs/>
+        </w:rPr>
+        <w:t>)</w:t>
       </w:r>
     </w:p>
     <w:p>
@@ -247,7 +405,23 @@
           <w:b/>
           <w:bCs/>
         </w:rPr>
-        <w:t>Torben Dörrer (Unverified)</w:t>
+        <w:t>Torben Dörrer (</w:t>
+      </w:r>
+      <w:proofErr w:type="spellStart"/>
+      <w:r>
+        <w:rPr>
+          <w:b/>
+          <w:bCs/>
+        </w:rPr>
+        <w:t>Unverified</w:t>
+      </w:r>
+      <w:proofErr w:type="spellEnd"/>
+      <w:r>
+        <w:rPr>
+          <w:b/>
+          <w:bCs/>
+        </w:rPr>
+        <w:t>)</w:t>
       </w:r>
     </w:p>
     <w:p>
@@ -273,17 +447,49 @@
           <w:b/>
           <w:bCs/>
         </w:rPr>
-        <w:t>Tobi Meyer (msg)</w:t>
-      </w:r>
-    </w:p>
-    <w:p>
-      <w:r>
-        <w:t>Ich öffne gerade die zugehörige Excel nach. Lass mal anschauen. Okay. Okay, dann Excel hat quasi pro Merkmal ein Blatt erzeugt, wenn ich es richtig sehe, und, ja, da hat der Gedankengang des Architekten, der Bauplan hat entscheidend, ob das bedeutet.</w:t>
-      </w:r>
-    </w:p>
-    <w:p>
-      <w:r>
-        <w:t>Okay, also, anscheinend... Findet eine Entscheidung statt, es notwendig ist oder nicht? Die Bedingungspartei. Dann können wir da jetzt einfach mal kurz eine Stichprobe machen.</w:t>
+        <w:t>Tobi Meyer (</w:t>
+      </w:r>
+      <w:proofErr w:type="spellStart"/>
+      <w:r>
+        <w:rPr>
+          <w:b/>
+          <w:bCs/>
+        </w:rPr>
+        <w:t>msg</w:t>
+      </w:r>
+      <w:proofErr w:type="spellEnd"/>
+      <w:r>
+        <w:rPr>
+          <w:b/>
+          <w:bCs/>
+        </w:rPr>
+        <w:t>)</w:t>
+      </w:r>
+    </w:p>
+    <w:p>
+      <w:r>
+        <w:t xml:space="preserve">Ich öffne gerade die zugehörige Excel nach. Lass mal anschauen. Okay. Okay, dann Excel </w:t>
+      </w:r>
+      <w:proofErr w:type="gramStart"/>
+      <w:r>
+        <w:t>hat quasi</w:t>
+      </w:r>
+      <w:proofErr w:type="gramEnd"/>
+      <w:r>
+        <w:t xml:space="preserve"> pro Merkmal ein Blatt erzeugt, wenn ich es richtig sehe, und, ja, da hat der Gedankengang des Architekten, der Bauplan hat entscheidend, ob das bedeutet.</w:t>
+      </w:r>
+    </w:p>
+    <w:p>
+      <w:r>
+        <w:t xml:space="preserve">Okay, also, anscheinend... Findet eine Entscheidung statt, es notwendig ist oder nicht? Die Bedingungspartei. Dann können wir da jetzt </w:t>
+      </w:r>
+      <w:proofErr w:type="gramStart"/>
+      <w:r>
+        <w:t>einfach mal</w:t>
+      </w:r>
+      <w:proofErr w:type="gramEnd"/>
+      <w:r>
+        <w:t xml:space="preserve"> kurz eine Stichprobe machen.</w:t>
       </w:r>
     </w:p>
     <w:p>
@@ -299,42 +505,111 @@
     </w:p>
     <w:p>
       <w:r>
-        <w:t>Okay, so. Gut, wir nehmen jetzt das da. Mal anschauen, also wir hätten an sich drei Werte, wobei der erste Wert rausfällt, wegen dieser Währung, das kennen wir ja, dass das nicht klassifiziert ist in dem Modell und deswegen fallen alle raus, das hat er quasi richtig gemacht und dann sehe ich eben beim Wert 2 gibt es eine einfache Vorbedingung mit FGAF mit diesen Werten und dann das gleiche nochmal mit 2,3 und entsprechend ist die generiert.</w:t>
-      </w:r>
-    </w:p>
-    <w:p>
-      <w:r>
-        <w:t>Tabelle hier richtig, diese, also als drittens, vermute mal, es soll da eine Syntax sein, um diese Tabelle aufzurufen, gut, die ist noch falsch, aber, dass die Tabelle richtig klappt schon mal, das ist ja cool, ja, also Syntax falsch, Tabelle richtig, wobei die,</w:t>
-      </w:r>
-    </w:p>
-    <w:p>
-      <w:r>
-        <w:t>Ja, die Syntaxi jetzt nicht dazu entscheiden, dann ist eigentlich so die Low Hanging Fruit, würde ich jetzt mal sagen.</w:t>
-      </w:r>
-    </w:p>
-    <w:p>
-      <w:r>
-        <w:t>Ich schrei einfach mal zum nächsten, VLT50PS, das haben wir hier, 4,6,7 Werte, der Werte hier scheinen richtig zu sein, also Zeilenanzahl schon mal, und genau, da musst du schauen, der Wert 0, der soll draußen sein, wegen Währung, genau, wurde auch richtig gelöst.</w:t>
-      </w:r>
-    </w:p>
-    <w:p>
-      <w:r>
-        <w:t>eingeyserde. kein Werte. Also die Tabelle sieht richtig aus, die Syntax ist wieder falsch. Nächstes Merkmal, WLPS, da wird sehr spannend, das denke ich kann jetzt auch nicht von Hand überprüfen.</w:t>
-      </w:r>
-    </w:p>
-    <w:p>
-      <w:r>
-        <w:t>Also offensichtlich würde hier keine Variant-Tabelle erzeugt und es wird oben erstens geschrieben, der Bauplan hat den Sky-Renode-Table. Da wird für jeden Eintrag aus Original Code-Mapping ein sauberes IP-State mit einer HVC-Syntax erstellt.</w:t>
-      </w:r>
-    </w:p>
-    <w:p>
-      <w:r>
-        <w:t>Okay, da wird es jetzt interessant, warum man bei so einer aufwändigen Bedingung zur Entscheidung kommt. Und NoTable, vielleicht weil es nicht möglich war, eine Tabellenstruktur zu erzeugen, die dafür passt, ja, ist jetzt sehr schwierig, da das jetzt wirklich zu vergleichen, man kann jetzt mal das Merkmal suchen, da können wir uns exemplarisch zwei, drei Werte vielleicht anschauen, so wenn man gleich muss, erst in dem pw02, das ist gut, das nächste wäre interessanter, weil da ist jetzt was kombiniert.</w:t>
-      </w:r>
-    </w:p>
-    <w:p>
-      <w:r>
-        <w:t>Eine einfache Bedingung mit einer negierten zusätzlichen Bedingung. Das war beim Wert PS01, den haben wir hier. Unclassified. Okay, also das Tool scheint erkennt zu haben, dass das Merkmal WLVU beim Wert PS01 von WLPS, das ist nicht Teil des Modells ist, also nicht in der Klasse 300 des Modells vorkommt und hat ihm daher einen Namen verpasst, unclassified WLVU.</w:t>
+        <w:t xml:space="preserve">Okay, so. Gut, wir nehmen jetzt das da. Mal anschauen, also wir hätten an sich drei Werte, wobei der erste Wert rausfällt, wegen dieser Währung, das kennen wir ja, dass das nicht </w:t>
+      </w:r>
+      <w:proofErr w:type="gramStart"/>
+      <w:r>
+        <w:t>klassifiziert</w:t>
+      </w:r>
+      <w:proofErr w:type="gramEnd"/>
+      <w:r>
+        <w:t xml:space="preserve"> ist in dem Modell und deswegen fallen alle raus, das hat er quasi richtig gemacht und dann sehe ich eben beim Wert 2 gibt es eine einfache Vorbedingung mit FGAF mit diesen Werten und dann das gleiche nochmal mit 2,3 und entsprechend ist die generiert.</w:t>
+      </w:r>
+    </w:p>
+    <w:p>
+      <w:r>
+        <w:t xml:space="preserve">Tabelle hier richtig, diese, also als drittens, vermute mal, es soll da eine Syntax sein, um diese Tabelle aufzurufen, gut, die ist noch falsch, aber, dass die Tabelle richtig </w:t>
+      </w:r>
+      <w:proofErr w:type="gramStart"/>
+      <w:r>
+        <w:t>klappt</w:t>
+      </w:r>
+      <w:proofErr w:type="gramEnd"/>
+      <w:r>
+        <w:t xml:space="preserve"> schon mal, das ist ja cool, ja, also Syntax falsch, Tabelle richtig, wobei die,</w:t>
+      </w:r>
+    </w:p>
+    <w:p>
+      <w:r>
+        <w:t xml:space="preserve">Ja, die </w:t>
+      </w:r>
+      <w:proofErr w:type="spellStart"/>
+      <w:r>
+        <w:t>Syntaxi</w:t>
+      </w:r>
+      <w:proofErr w:type="spellEnd"/>
+      <w:r>
+        <w:t xml:space="preserve"> jetzt nicht dazu entscheiden, dann ist eigentlich so die Low Hanging Fruit, würde ich jetzt mal sagen.</w:t>
+      </w:r>
+    </w:p>
+    <w:p>
+      <w:r>
+        <w:t xml:space="preserve">Ich schrei </w:t>
+      </w:r>
+      <w:proofErr w:type="gramStart"/>
+      <w:r>
+        <w:t>einfach mal</w:t>
+      </w:r>
+      <w:proofErr w:type="gramEnd"/>
+      <w:r>
+        <w:t xml:space="preserve"> zum nächsten, VLT50PS, das haben wir hier, 4,6,7 Werte, der Werte hier scheinen richtig zu sein, also Zeilenanzahl schon mal, und genau, da musst du schauen, der Wert 0, der soll draußen sein, wegen Währung, genau, wurde auch richtig gelöst.</w:t>
+      </w:r>
+    </w:p>
+    <w:p>
+      <w:proofErr w:type="spellStart"/>
+      <w:r>
+        <w:t>eingeyserde</w:t>
+      </w:r>
+      <w:proofErr w:type="spellEnd"/>
+      <w:r>
+        <w:t>. kein Werte. Also die Tabelle sieht richtig aus, die Syntax ist wieder falsch. Nächstes Merkmal, WLPS, da wird sehr spannend, das denke ich kann jetzt auch nicht von Hand überprüfen.</w:t>
+      </w:r>
+    </w:p>
+    <w:p>
+      <w:r>
+        <w:t>Also offensichtlich würde hier keine Variant-Tabelle erzeugt und es wird oben erstens geschrieben, der Bauplan hat den Sky-</w:t>
+      </w:r>
+      <w:proofErr w:type="spellStart"/>
+      <w:r>
+        <w:t>Renode</w:t>
+      </w:r>
+      <w:proofErr w:type="spellEnd"/>
+      <w:r>
+        <w:t>-Table. Da wird für jeden Eintrag aus Original Code-Mapping ein sauberes IP-State mit einer HVC-Syntax erstellt.</w:t>
+      </w:r>
+    </w:p>
+    <w:p>
+      <w:r>
+        <w:t xml:space="preserve">Okay, da wird es jetzt interessant, warum man bei so einer aufwändigen Bedingung zur Entscheidung kommt. Und </w:t>
+      </w:r>
+      <w:proofErr w:type="spellStart"/>
+      <w:r>
+        <w:t>NoTable</w:t>
+      </w:r>
+      <w:proofErr w:type="spellEnd"/>
+      <w:r>
+        <w:t>, vielleicht weil es nicht möglich war, eine Tabellenstruktur zu erzeugen, die dafür passt, ja, ist jetzt sehr schwierig, da das jetzt wirklich zu vergleichen, man kann jetzt mal das Merkmal suchen, da können wir uns exemplarisch zwei, drei Werte vielleicht anschauen, so wenn man gleich muss, erst in dem pw02, das ist gut, das nächste wäre interessanter, weil da ist jetzt was kombiniert.</w:t>
+      </w:r>
+    </w:p>
+    <w:p>
+      <w:r>
+        <w:t xml:space="preserve">Eine einfache Bedingung mit einer negierten zusätzlichen Bedingung. Das war beim Wert PS01, den haben wir hier. </w:t>
+      </w:r>
+      <w:proofErr w:type="spellStart"/>
+      <w:r>
+        <w:t>Unclassified</w:t>
+      </w:r>
+      <w:proofErr w:type="spellEnd"/>
+      <w:r>
+        <w:t xml:space="preserve">. Okay, also das Tool scheint erkennt zu haben, dass das Merkmal WLVU beim Wert PS01 von WLPS, das ist nicht Teil des Modells ist, also nicht in der Klasse 300 des Modells vorkommt und hat ihm daher einen Namen verpasst, </w:t>
+      </w:r>
+      <w:proofErr w:type="spellStart"/>
+      <w:r>
+        <w:t>unclassified</w:t>
+      </w:r>
+      <w:proofErr w:type="spellEnd"/>
+      <w:r>
+        <w:t xml:space="preserve"> WLVU.</w:t>
       </w:r>
     </w:p>
     <w:p>
@@ -345,17 +620,89 @@
     </w:p>
     <w:p>
       <w:r>
-        <w:t>Weil so wie die LOVC-Engine arbeitet, wird quasi eine Abfrage eines unklassifizierten Merkmals auf einen konkreten Wert mit True zurückgegeben, also der Teil von der Bedingung wäre immer erfüllt und damit würde quasi, okay, ich habe den ersten Teil auch noch gesehen, dass Griffwort ja auch gar nicht klassifiziert ist bei uns jetzt, was wahrscheinlich wirklich so ist, möchte ich mal kurz überprüfen.</w:t>
-      </w:r>
-    </w:p>
-    <w:p>
-      <w:r>
-        <w:t>Genau, das ist wirklich nicht klassifiziert. Okay, dann wäre quasi auch beim ersten Teil. Das wird dann schon heißen, PW02, der Wert wäre ohne Bedingungen immer vorhanden, also pw02, was immer dann in der Tabelle wäre, hätte nur Wildcards und so wäre es halt dann möglich, eine Tabelle aufzubauen, das erklärt mir jetzt glaube ich, warum er es hier nicht geschafft hat, eine Tabelle aufzubauen, weil ihm die unklassifizierten Merkmale vielleicht Probleme machen, dass er die nicht draufschmeißt, nur Vermutung jetzt.</w:t>
-      </w:r>
-    </w:p>
-    <w:p>
-      <w:r>
-        <w:t>Genau, weil da quasi, ja, wir haben da ja sehr viele an Classified, und es ist ja gut, dass er erkennt, dass die nicht Classified sind, nur quasi fehlt jetzt der nächste Schritt noch, dass er die rausnimmt, um dann die Bedingungen nur mit den klassifizierten Merkmalen aufzubauen, weil der Ziel ist immer nur im Kontext,</w:t>
+        <w:t xml:space="preserve">Weil so wie die LOVC-Engine arbeitet, </w:t>
+      </w:r>
+      <w:proofErr w:type="gramStart"/>
+      <w:r>
+        <w:t>wird quasi</w:t>
+      </w:r>
+      <w:proofErr w:type="gramEnd"/>
+      <w:r>
+        <w:t xml:space="preserve"> eine Abfrage eines </w:t>
+      </w:r>
+      <w:proofErr w:type="spellStart"/>
+      <w:r>
+        <w:t>unklassifizierten</w:t>
+      </w:r>
+      <w:proofErr w:type="spellEnd"/>
+      <w:r>
+        <w:t xml:space="preserve"> Merkmals auf einen konkreten Wert mit True zurückgegeben, also der Teil von der Bedingung wäre immer erfüllt und damit würde quasi, okay, ich habe den ersten Teil auch noch gesehen, dass Griffwort ja auch gar nicht klassifiziert ist bei uns jetzt, was wahrscheinlich wirklich so ist, möchte ich mal kurz überprüfen.</w:t>
+      </w:r>
+    </w:p>
+    <w:p>
+      <w:r>
+        <w:t xml:space="preserve">Genau, das ist wirklich nicht klassifiziert. Okay, dann </w:t>
+      </w:r>
+      <w:proofErr w:type="gramStart"/>
+      <w:r>
+        <w:t>wäre quasi</w:t>
+      </w:r>
+      <w:proofErr w:type="gramEnd"/>
+      <w:r>
+        <w:t xml:space="preserve"> auch beim ersten Teil. Das wird dann schon heißen, PW02, der Wert wäre ohne Bedingungen immer vorhanden, also pw02, was immer dann in der Tabelle wäre, hätte nur Wildcards und so wäre es halt dann möglich, eine Tabelle aufzubauen, das erklärt mir jetzt glaube ich, warum er es hier nicht geschafft hat, eine Tabelle aufzubauen, weil ihm die </w:t>
+      </w:r>
+      <w:proofErr w:type="spellStart"/>
+      <w:r>
+        <w:t>unklassifizierten</w:t>
+      </w:r>
+      <w:proofErr w:type="spellEnd"/>
+      <w:r>
+        <w:t xml:space="preserve"> Merkmale vielleicht Probleme machen, dass er die nicht draufschmeißt, nur Vermutung jetzt.</w:t>
+      </w:r>
+    </w:p>
+    <w:p>
+      <w:r>
+        <w:t xml:space="preserve">Genau, weil </w:t>
+      </w:r>
+      <w:proofErr w:type="gramStart"/>
+      <w:r>
+        <w:t>da quasi</w:t>
+      </w:r>
+      <w:proofErr w:type="gramEnd"/>
+      <w:r>
+        <w:t xml:space="preserve">, ja, wir haben da ja sehr viele an </w:t>
+      </w:r>
+      <w:proofErr w:type="spellStart"/>
+      <w:r>
+        <w:t>Classified</w:t>
+      </w:r>
+      <w:proofErr w:type="spellEnd"/>
+      <w:r>
+        <w:t xml:space="preserve">, und es ist ja gut, dass er erkennt, dass die nicht </w:t>
+      </w:r>
+      <w:proofErr w:type="spellStart"/>
+      <w:r>
+        <w:t>Classified</w:t>
+      </w:r>
+      <w:proofErr w:type="spellEnd"/>
+      <w:r>
+        <w:t xml:space="preserve"> sind, nur quasi fehlt jetzt der nächste Schritt noch, dass er die rausnimmt, um dann die Bedingungen nur mit den klassifizierten Merkmalen aufzubauen, </w:t>
+      </w:r>
+      <w:proofErr w:type="gramStart"/>
+      <w:r>
+        <w:t>weil</w:t>
+      </w:r>
+      <w:proofErr w:type="gramEnd"/>
+      <w:r>
+        <w:t xml:space="preserve"> </w:t>
+      </w:r>
+      <w:proofErr w:type="gramStart"/>
+      <w:r>
+        <w:t>der Ziel</w:t>
+      </w:r>
+      <w:proofErr w:type="gramEnd"/>
+      <w:r>
+        <w:t xml:space="preserve"> ist immer nur im Kontext,</w:t>
       </w:r>
     </w:p>
     <w:p>
@@ -370,17 +717,57 @@
     </w:p>
     <w:p>
       <w:r>
-        <w:t>Also schauen wir mal, das Merkmal hat drei Werte und es hat jetzt quasi, okay, da scheint dann irgendwas schiefgelaufen zu sein, weil er hat quasi für den ersten Wert, da ist die Specified Währung drin, also die Bedingung, die er rauswerfen kann und die hat er hier mit Unclassified Währung angegeben, also er hat erkannt, dass die Währung nicht da ist, aber er hat es trotzdem nicht rausgeschmissen.</w:t>
-      </w:r>
-    </w:p>
-    <w:p>
-      <w:r>
-        <w:t>Etwas, was er beim ersten Fall, den wir uns gleich angeschaut haben, anders und zwar richtig gemacht hat, weil bei WLT50SCHP, da gab es ja auch den Wert 1.</w:t>
-      </w:r>
-    </w:p>
-    <w:p>
-      <w:r>
-        <w:t>Der über diese Specified-Währung herausgefallen ist und das hat er hier gemacht, während hier jetzt hat er die eine Bedingung aufgeführt und die anderen beiden Werte 0.2, 0.3, die haben tatsächlich Bedingungen, denke ich, die abfragbar wären, weil ich gehe jetzt mal davon aus, genau, das Merkmal WLT50FG AF ist vorhanden und entsprechend könnten, wäre es möglich, gewesen, eine Tabelle aufzubauen, hier bei einem Merkmal, also die Tabelle wäre dann eben gewesen, das Merkmal WLT50SCHP in Kombination mit T50FG AF, also so hätte sich hier eine funktionierende Tabelle aufbauen sollen.</w:t>
+        <w:t xml:space="preserve">Also schauen wir mal, das Merkmal hat drei Werte und es hat jetzt quasi, okay, da scheint dann irgendwas schiefgelaufen zu sein, </w:t>
+      </w:r>
+      <w:proofErr w:type="gramStart"/>
+      <w:r>
+        <w:t>weil</w:t>
+      </w:r>
+      <w:proofErr w:type="gramEnd"/>
+      <w:r>
+        <w:t xml:space="preserve"> er hat quasi für den ersten Wert, da ist die </w:t>
+      </w:r>
+      <w:proofErr w:type="spellStart"/>
+      <w:r>
+        <w:t>Specified</w:t>
+      </w:r>
+      <w:proofErr w:type="spellEnd"/>
+      <w:r>
+        <w:t xml:space="preserve"> Währung drin, also die Bedingung, die er rauswerfen kann und die hat er hier mit </w:t>
+      </w:r>
+      <w:proofErr w:type="spellStart"/>
+      <w:r>
+        <w:t>Unclassified</w:t>
+      </w:r>
+      <w:proofErr w:type="spellEnd"/>
+      <w:r>
+        <w:t xml:space="preserve"> Währung angegeben, also er hat erkannt, dass die Währung nicht da ist, aber er hat es trotzdem nicht rausgeschmissen.</w:t>
+      </w:r>
+    </w:p>
+    <w:p>
+      <w:r>
+        <w:t xml:space="preserve">Etwas, was er beim ersten Fall, den wir uns gleich angeschaut haben, </w:t>
+      </w:r>
+      <w:proofErr w:type="gramStart"/>
+      <w:r>
+        <w:t>anders</w:t>
+      </w:r>
+      <w:proofErr w:type="gramEnd"/>
+      <w:r>
+        <w:t xml:space="preserve"> und zwar richtig gemacht hat, weil bei WLT50SCHP, da gab es ja auch den Wert 1.</w:t>
+      </w:r>
+    </w:p>
+    <w:p>
+      <w:r>
+        <w:t xml:space="preserve">Der über diese </w:t>
+      </w:r>
+      <w:proofErr w:type="spellStart"/>
+      <w:r>
+        <w:t>Specified</w:t>
+      </w:r>
+      <w:proofErr w:type="spellEnd"/>
+      <w:r>
+        <w:t>-Währung herausgefallen ist und das hat er hier gemacht, während hier jetzt hat er die eine Bedingung aufgeführt und die anderen beiden Werte 0.2, 0.3, die haben tatsächlich Bedingungen, denke ich, die abfragbar wären, weil ich gehe jetzt mal davon aus, genau, das Merkmal WLT50FG AF ist vorhanden und entsprechend könnten, wäre es möglich, gewesen, eine Tabelle aufzubauen, hier bei einem Merkmal, also die Tabelle wäre dann eben gewesen, das Merkmal WLT50SCHP in Kombination mit T50FG AF, also so hätte sich hier eine funktionierende Tabelle aufbauen sollen.</w:t>
       </w:r>
     </w:p>
     <w:p>
@@ -407,7 +794,23 @@
           <w:b/>
           <w:bCs/>
         </w:rPr>
-        <w:t>Torben Dörrer (Unverified)</w:t>
+        <w:t>Torben Dörrer (</w:t>
+      </w:r>
+      <w:proofErr w:type="spellStart"/>
+      <w:r>
+        <w:rPr>
+          <w:b/>
+          <w:bCs/>
+        </w:rPr>
+        <w:t>Unverified</w:t>
+      </w:r>
+      <w:proofErr w:type="spellEnd"/>
+      <w:r>
+        <w:rPr>
+          <w:b/>
+          <w:bCs/>
+        </w:rPr>
+        <w:t>)</w:t>
       </w:r>
     </w:p>
     <w:p>
@@ -433,7 +836,23 @@
           <w:b/>
           <w:bCs/>
         </w:rPr>
-        <w:t>Tobi Meyer (msg)</w:t>
+        <w:t>Tobi Meyer (</w:t>
+      </w:r>
+      <w:proofErr w:type="spellStart"/>
+      <w:r>
+        <w:rPr>
+          <w:b/>
+          <w:bCs/>
+        </w:rPr>
+        <w:t>msg</w:t>
+      </w:r>
+      <w:proofErr w:type="spellEnd"/>
+      <w:r>
+        <w:rPr>
+          <w:b/>
+          <w:bCs/>
+        </w:rPr>
+        <w:t>)</w:t>
       </w:r>
     </w:p>
     <w:p>
@@ -448,7 +867,15 @@
     </w:p>
     <w:p>
       <w:r>
-        <w:t>Der 7016 wird eigentlich überbleiben. Also es wäre eigentlich eine Tabelle mit wirklich nur, wenn man es jetzt mal einträgt, Tabelle wäre Überschrift und 7016 und das wäre es in dem Fall eigentlich.</w:t>
+        <w:t xml:space="preserve">Der 7016 wird eigentlich überbleiben. Also es wäre eigentlich eine Tabelle mit </w:t>
+      </w:r>
+      <w:proofErr w:type="gramStart"/>
+      <w:r>
+        <w:t>wirklich nur</w:t>
+      </w:r>
+      <w:proofErr w:type="gramEnd"/>
+      <w:r>
+        <w:t>, wenn man es jetzt mal einträgt, Tabelle wäre Überschrift und 7016 und das wäre es in dem Fall eigentlich.</w:t>
       </w:r>
     </w:p>
     <w:p>
@@ -463,23 +890,79 @@
     </w:p>
     <w:p>
       <w:r>
-        <w:t>Schauen wir mal zum nächsten. Wieder das Merkmal PS gleich, das ist ja eines der aufwändigsten Merkmale hier in dem Modell und da sieht man gleich ein ähnliches Bild wie vorher, dass quasi nicht möglich war, die Tabelle aufzuspannen, eben diese unclassified Merkmale hier aufgeführt.</w:t>
-      </w:r>
-    </w:p>
-    <w:p>
-      <w:r>
-        <w:t>Also da würde ich jetzt so den, nach allem was ich bisher gesehen habe, den ersten großen Verbesserungsschritt darin sehen, wenn man es eben schafft wird, diese unclassified in dem Fall einfach rauszuwerfen und es wird dann einfach von der Bedingung, die hier aufgelistet wird, also bei dem Merkmal da zum Beispiel, da würde eigentlich nichts überbleiben und dieser Wert PSHA wäre bedingungslos immer verfügbar zum Beispiel.</w:t>
-      </w:r>
-    </w:p>
-    <w:p>
-      <w:r>
-        <w:t>Also da, das wäre so das erste große To-Do eigentlich für das Tool, wenn es weitergehen sollte, dass er das schafft und ich denke, wenn er die unclassified Merkmale auch dann rausschmeißen wird, dann wären die Chancen gut, dass auch Tabelle bildbar wäre.</w:t>
+        <w:t xml:space="preserve">Schauen wir mal zum nächsten. Wieder das Merkmal PS gleich, das ist ja eines der aufwändigsten Merkmale hier in dem Modell und da sieht man gleich ein ähnliches Bild wie vorher, dass quasi nicht möglich war, die Tabelle aufzuspannen, eben diese </w:t>
+      </w:r>
+      <w:proofErr w:type="spellStart"/>
+      <w:r>
+        <w:t>unclassified</w:t>
+      </w:r>
+      <w:proofErr w:type="spellEnd"/>
+      <w:r>
+        <w:t xml:space="preserve"> Merkmale hier aufgeführt.</w:t>
+      </w:r>
+    </w:p>
+    <w:p>
+      <w:r>
+        <w:t xml:space="preserve">Also da würde ich jetzt so den, nach </w:t>
+      </w:r>
+      <w:proofErr w:type="gramStart"/>
+      <w:r>
+        <w:t>allem</w:t>
+      </w:r>
+      <w:proofErr w:type="gramEnd"/>
+      <w:r>
+        <w:t xml:space="preserve"> was ich bisher gesehen habe, den ersten großen Verbesserungsschritt darin sehen, wenn man es eben </w:t>
+      </w:r>
+      <w:proofErr w:type="gramStart"/>
+      <w:r>
+        <w:t>schafft</w:t>
+      </w:r>
+      <w:proofErr w:type="gramEnd"/>
+      <w:r>
+        <w:t xml:space="preserve"> wird, diese </w:t>
+      </w:r>
+      <w:proofErr w:type="spellStart"/>
+      <w:r>
+        <w:t>unclassified</w:t>
+      </w:r>
+      <w:proofErr w:type="spellEnd"/>
+      <w:r>
+        <w:t xml:space="preserve"> in dem Fall einfach rauszuwerfen und es wird dann einfach von der Bedingung, die hier aufgelistet wird, also bei dem Merkmal da zum Beispiel, da würde eigentlich nichts überbleiben und dieser Wert PSHA wäre bedingungslos immer verfügbar zum Beispiel.</w:t>
+      </w:r>
+    </w:p>
+    <w:p>
+      <w:r>
+        <w:t xml:space="preserve">Also da, das wäre so das erste große </w:t>
+      </w:r>
+      <w:proofErr w:type="spellStart"/>
+      <w:r>
+        <w:t>To</w:t>
+      </w:r>
+      <w:proofErr w:type="spellEnd"/>
+      <w:r>
+        <w:t xml:space="preserve">-Do eigentlich für das Tool, wenn es weitergehen sollte, dass er das schafft und ich denke, wenn er die </w:t>
+      </w:r>
+      <w:proofErr w:type="spellStart"/>
+      <w:r>
+        <w:t>unclassified</w:t>
+      </w:r>
+      <w:proofErr w:type="spellEnd"/>
+      <w:r>
+        <w:t xml:space="preserve"> Merkmale auch dann rausschmeißen wird, dann wären die Chancen gut, dass auch Tabelle bildbar wäre.</w:t>
       </w:r>
     </w:p>
     <w:p>
       <w:r>
         <w:lastRenderedPageBreak/>
-        <w:t>Wieder ein ähnliches Bild da rein, ist so ähnlich wie davor, hier wird quasi bei WLPS FB14, würden die letzten beiden Werte eigentlich ohne Bedingungen überbleiben, also wäre wieder ganz einfache Tabelle mit einer Spalte und die beiden Werten 70, 16 und 3000.</w:t>
+        <w:t xml:space="preserve">Wieder ein ähnliches Bild da rein, ist so ähnlich wie davor, hier </w:t>
+      </w:r>
+      <w:proofErr w:type="gramStart"/>
+      <w:r>
+        <w:t>wird quasi</w:t>
+      </w:r>
+      <w:proofErr w:type="gramEnd"/>
+      <w:r>
+        <w:t xml:space="preserve"> bei WLPS FB14, würden die letzten beiden Werte eigentlich ohne Bedingungen überbleiben, also wäre wieder ganz einfache Tabelle mit einer Spalte und die beiden Werten 70, 16 und 3000.</w:t>
       </w:r>
     </w:p>
     <w:p>
@@ -489,22 +972,86 @@
     </w:p>
     <w:p>
       <w:r>
-        <w:t>Das ist ja dieses Wirkmal hier, oder? Dann ist jetzt beim Wert 2. Ne, ist identisch, genau. Da scheint sich eine kleine Halluzination eingeschlichen zu haben mit zweimal unclassified.</w:t>
-      </w:r>
-    </w:p>
-    <w:p>
-      <w:r>
-        <w:t>Aber ansonsten scheint er, also er scheint richtig zu übernehmen, wo Bedingungen sind. Also mir ist jetzt noch nichts aufgefallen, dass irgendwo eine Bedingung wäre und er hat eine dazu ergänzt.</w:t>
-      </w:r>
-    </w:p>
-    <w:p>
-      <w:r>
-        <w:t>Er hat einen übersehen, jetzt bisher ist mir nichts aufgefallen, okay, da ist jetzt ein bisschen schwieg, kann mal schauen, weil das ist jetzt riesig, ja, jetzt sieht man mehr, ja, dieses M1-Merkmal, das ist ja, wird eins von den größten und, ja, ist jetzt nicht möglich, dass man da jetzt wirklich überprüft, ob was fehlt, aber er erscheint schon, ist mein Eindruck, zuverlässig, da drüber zu gehen, wir schauen mal, Specified Währung, geht bis zum Wert 47 ohne Zusatzbedingungen.</w:t>
-      </w:r>
-    </w:p>
-    <w:p>
-      <w:r>
-        <w:t>Genau, dann jetzt, also scheint soweit eigentlich gut durchzugehen, genau, also für mich wäre das interessant, wie was zu der Entscheidung kommt, No Table oder Ja Table, und leider scheint es ja mehr Fälle zu geben, wo er es nicht schafft, eine Table zu bilden, und was aber direkt zusammenzuziehen scheint mit den nicht klassifizierten Merkmalen, also, dass man eindruckt, sobald da jetzt eins drin ist, springt er auf No Was eben ein bisschen schade ist, weil es ja bei richtigen Vorgehen könnte, trotzdem ein Table bilden, genau.</w:t>
+        <w:t xml:space="preserve">Das ist </w:t>
+      </w:r>
+      <w:proofErr w:type="gramStart"/>
+      <w:r>
+        <w:t>ja dieses</w:t>
+      </w:r>
+      <w:proofErr w:type="gramEnd"/>
+      <w:r>
+        <w:t xml:space="preserve"> </w:t>
+      </w:r>
+      <w:proofErr w:type="spellStart"/>
+      <w:r>
+        <w:t>Wirkmal</w:t>
+      </w:r>
+      <w:proofErr w:type="spellEnd"/>
+      <w:r>
+        <w:t xml:space="preserve"> hier, oder? Dann ist jetzt beim Wert 2. Ne, ist identisch, genau. Da scheint sich eine kleine Halluzination eingeschlichen zu haben mit zweimal </w:t>
+      </w:r>
+      <w:proofErr w:type="spellStart"/>
+      <w:r>
+        <w:t>unclassified</w:t>
+      </w:r>
+      <w:proofErr w:type="spellEnd"/>
+      <w:r>
+        <w:t>.</w:t>
+      </w:r>
+    </w:p>
+    <w:p>
+      <w:r>
+        <w:t xml:space="preserve">Aber ansonsten scheint er, also </w:t>
+      </w:r>
+      <w:proofErr w:type="spellStart"/>
+      <w:r>
+        <w:t>er scheint</w:t>
+      </w:r>
+      <w:proofErr w:type="spellEnd"/>
+      <w:r>
+        <w:t xml:space="preserve"> richtig zu übernehmen, wo Bedingungen sind. Also mir ist jetzt noch nichts aufgefallen, dass irgendwo eine Bedingung wäre und er hat eine dazu ergänzt.</w:t>
+      </w:r>
+    </w:p>
+    <w:p>
+      <w:r>
+        <w:t xml:space="preserve">Er hat einen übersehen, jetzt bisher ist mir nichts aufgefallen, okay, da ist jetzt ein bisschen schwieg, kann mal schauen, weil das </w:t>
+      </w:r>
+      <w:proofErr w:type="gramStart"/>
+      <w:r>
+        <w:t>ist</w:t>
+      </w:r>
+      <w:proofErr w:type="gramEnd"/>
+      <w:r>
+        <w:t xml:space="preserve"> jetzt riesig, ja, jetzt sieht man mehr, ja, dieses M1-Merkmal, das ist ja, wird eins von den größten und, ja, ist jetzt nicht möglich, dass man da jetzt wirklich überprüft, ob was fehlt, aber er erscheint schon, ist mein Eindruck, zuverlässig, da drüber zu gehen, wir schauen mal, </w:t>
+      </w:r>
+      <w:proofErr w:type="spellStart"/>
+      <w:r>
+        <w:t>Specified</w:t>
+      </w:r>
+      <w:proofErr w:type="spellEnd"/>
+      <w:r>
+        <w:t xml:space="preserve"> Währung, geht bis zum Wert 47 ohne Zusatzbedingungen.</w:t>
+      </w:r>
+    </w:p>
+    <w:p>
+      <w:r>
+        <w:t xml:space="preserve">Genau, dann jetzt, also scheint soweit eigentlich gut durchzugehen, genau, also für mich wäre das interessant, wie was zu der Entscheidung kommt, </w:t>
+      </w:r>
+      <w:proofErr w:type="spellStart"/>
+      <w:r>
+        <w:t>No</w:t>
+      </w:r>
+      <w:proofErr w:type="spellEnd"/>
+      <w:r>
+        <w:t xml:space="preserve"> Table oder Ja Table, und leider scheint es ja mehr Fälle zu geben, wo er es nicht schafft, eine Table zu bilden, und was aber direkt zusammenzuziehen scheint mit den nicht klassifizierten Merkmalen, also, dass man eindruckt, sobald da jetzt eins drin ist, springt er auf </w:t>
+      </w:r>
+      <w:proofErr w:type="spellStart"/>
+      <w:r>
+        <w:t>No</w:t>
+      </w:r>
+      <w:proofErr w:type="spellEnd"/>
+      <w:r>
+        <w:t xml:space="preserve"> Was eben ein bisschen schade ist, weil es ja bei richtigen Vorgehen könnte, trotzdem ein Table bilden, genau.</w:t>
       </w:r>
     </w:p>
     <w:p>
@@ -530,7 +1077,23 @@
           <w:b/>
           <w:bCs/>
         </w:rPr>
-        <w:t>Torben Dörrer (Unverified)</w:t>
+        <w:t>Torben Dörrer (</w:t>
+      </w:r>
+      <w:proofErr w:type="spellStart"/>
+      <w:r>
+        <w:rPr>
+          <w:b/>
+          <w:bCs/>
+        </w:rPr>
+        <w:t>Unverified</w:t>
+      </w:r>
+      <w:proofErr w:type="spellEnd"/>
+      <w:r>
+        <w:rPr>
+          <w:b/>
+          <w:bCs/>
+        </w:rPr>
+        <w:t>)</w:t>
       </w:r>
     </w:p>
     <w:p>
@@ -561,13 +1124,45 @@
           <w:b/>
           <w:bCs/>
         </w:rPr>
-        <w:t>Tobi Meyer (msg)</w:t>
+        <w:t>Tobi Meyer (</w:t>
+      </w:r>
+      <w:proofErr w:type="spellStart"/>
+      <w:r>
+        <w:rPr>
+          <w:b/>
+          <w:bCs/>
+        </w:rPr>
+        <w:t>msg</w:t>
+      </w:r>
+      <w:proofErr w:type="spellEnd"/>
+      <w:r>
+        <w:rPr>
+          <w:b/>
+          <w:bCs/>
+        </w:rPr>
+        <w:t>)</w:t>
       </w:r>
     </w:p>
     <w:p>
       <w:r>
         <w:lastRenderedPageBreak/>
-        <w:t>Nummer 3, KMT40. Was ist da ein Master? Ich bin gerade beim erstgleichschauen, um welches Merkmal es sich jetzt handelt, weil ich bin kein WLT40 Master.</w:t>
+        <w:t xml:space="preserve">Nummer 3, KMT40. Was ist da ein Master? Ich bin gerade </w:t>
+      </w:r>
+      <w:proofErr w:type="gramStart"/>
+      <w:r>
+        <w:t>beim erstgleichschauen</w:t>
+      </w:r>
+      <w:proofErr w:type="gramEnd"/>
+      <w:r>
+        <w:t xml:space="preserve">, um welches Merkmal es sich jetzt handelt, weil ich </w:t>
+      </w:r>
+      <w:proofErr w:type="gramStart"/>
+      <w:r>
+        <w:t>bin</w:t>
+      </w:r>
+      <w:proofErr w:type="gramEnd"/>
+      <w:r>
+        <w:t xml:space="preserve"> kein WLT40 Master.</w:t>
       </w:r>
     </w:p>
     <w:p>
@@ -577,7 +1172,15 @@
     </w:p>
     <w:p>
       <w:r>
-        <w:t>Ne, gibt es nicht. Also da hat es jetzt irgendwas, weil quasi die... Also ich gehe mal stark davon aus, dass hier tatsächlich dieses Merkmal steht, wobei es da jetzt nur eigentlich die erste...</w:t>
+        <w:t xml:space="preserve">Ne, gibt es nicht. Also da hat es jetzt irgendwas, </w:t>
+      </w:r>
+      <w:proofErr w:type="gramStart"/>
+      <w:r>
+        <w:t>weil quasi</w:t>
+      </w:r>
+      <w:proofErr w:type="gramEnd"/>
+      <w:r>
+        <w:t xml:space="preserve"> die... Also ich gehe mal stark davon aus, dass hier tatsächlich dieses Merkmal steht, wobei es da jetzt nur eigentlich die erste...</w:t>
       </w:r>
     </w:p>
     <w:p>
@@ -597,7 +1200,15 @@
     </w:p>
     <w:p>
       <w:r>
-        <w:t>Und mal schauen, gibt's unten ein Blatt dafür? Irgendwie kann man sich doch alle Blätter anzeigen, oder bin ich da zu schmal jetzt unterwegs, da ist es, naja, das passt ja nicht mehr, aber gibt es noch eine Platte mit einem anderen Werkmal, die VLT40GR, gibt es da eine Platte noch, ne, gibt es keine, also das muss schon VLT40GR sein, also VLT40Master ist tatsächlich VLT40GR, und</w:t>
+        <w:t xml:space="preserve">Und mal schauen, gibt's unten ein Blatt dafür? Irgendwie kann man sich doch alle Blätter anzeigen, oder bin ich da zu schmal jetzt unterwegs, da ist es, naja, das passt ja nicht mehr, aber gibt es noch eine Platte mit einem anderen </w:t>
+      </w:r>
+      <w:proofErr w:type="spellStart"/>
+      <w:r>
+        <w:t>Werkmal</w:t>
+      </w:r>
+      <w:proofErr w:type="spellEnd"/>
+      <w:r>
+        <w:t>, die VLT40GR, gibt es da eine Platte noch, ne, gibt es keine, also das muss schon VLT40GR sein, also VLT40Master ist tatsächlich VLT40GR, und</w:t>
       </w:r>
     </w:p>
     <w:p>
@@ -607,27 +1218,88 @@
     </w:p>
     <w:p>
       <w:r>
-        <w:t>PG hat nämlich Specified Währung und das müsste eigentlich rausfliegen. Der ist eigentlich weg vom Fenster. Er hat den zweiten Teil, also es gibt zwei Bedingungen, die zweite, die hat er korrekt übernommen, dass WLT40FGAF gleich zwei sein muss, aber er hat übersehen, dass es auch noch Specified Währung gibt an der Stelle.</w:t>
-      </w:r>
-    </w:p>
-    <w:p>
-      <w:r>
-        <w:t>Beim GR... ist richtig und WG ist auch richtig. Genau, die sind immer nur mit den Werten 1 und 3 von WLT40FGAF möglich.</w:t>
-      </w:r>
-    </w:p>
-    <w:p>
-      <w:r>
-        <w:t>Also es passt. Was halt dann darunter noch passiert ist, ist nicht nachvollziehbar, weil es gibt keine Werte, keine 1 bis 9 Werte für das Merkmal.</w:t>
-      </w:r>
-    </w:p>
-    <w:p>
-      <w:r>
-        <w:t>Genau, schauen wir mal zum nächsten. Hier hat wieder Tabelle gebildet, diesmal mit drei Spalten. Ich ist die erste Tabelle, die ich jetzt hier gesehen habe, mit zwei Spalten, äh drei Spalten.</w:t>
-      </w:r>
-    </w:p>
-    <w:p>
-      <w:r>
-        <w:t>Und es sieht dann ja ganz interessant aus, weil er bin gespannt, weil es gibt eigentlich mehr Werte und er hat anscheinend viele ausgeschlossen.</w:t>
+        <w:t xml:space="preserve">PG hat nämlich </w:t>
+      </w:r>
+      <w:proofErr w:type="spellStart"/>
+      <w:r>
+        <w:t>Specified</w:t>
+      </w:r>
+      <w:proofErr w:type="spellEnd"/>
+      <w:r>
+        <w:t xml:space="preserve"> Währung und das müsste eigentlich rausfliegen. Der ist eigentlich weg vom Fenster. Er hat den zweiten Teil, also es gibt zwei Bedingungen, die zweite, die hat er korrekt übernommen, dass WLT40FGAF gleich zwei sein muss, aber er hat übersehen, dass es auch noch </w:t>
+      </w:r>
+      <w:proofErr w:type="spellStart"/>
+      <w:r>
+        <w:t>Specified</w:t>
+      </w:r>
+      <w:proofErr w:type="spellEnd"/>
+      <w:r>
+        <w:t xml:space="preserve"> Währung gibt an der Stelle.</w:t>
+      </w:r>
+    </w:p>
+    <w:p>
+      <w:r>
+        <w:t xml:space="preserve">Beim </w:t>
+      </w:r>
+      <w:proofErr w:type="gramStart"/>
+      <w:r>
+        <w:t>GR...</w:t>
+      </w:r>
+      <w:proofErr w:type="gramEnd"/>
+      <w:r>
+        <w:t xml:space="preserve"> ist richtig und WG ist auch richtig. Genau, die sind immer nur mit den Werten 1 und 3 von WLT40FGAF möglich.</w:t>
+      </w:r>
+    </w:p>
+    <w:p>
+      <w:r>
+        <w:t xml:space="preserve">Also es passt. Was halt dann darunter noch passiert ist, ist nicht nachvollziehbar, </w:t>
+      </w:r>
+      <w:proofErr w:type="gramStart"/>
+      <w:r>
+        <w:t>weil</w:t>
+      </w:r>
+      <w:proofErr w:type="gramEnd"/>
+      <w:r>
+        <w:t xml:space="preserve"> es gibt keine Werte, keine 1 bis 9 Werte für das Merkmal.</w:t>
+      </w:r>
+    </w:p>
+    <w:p>
+      <w:proofErr w:type="gramStart"/>
+      <w:r>
+        <w:t>Genau,</w:t>
+      </w:r>
+      <w:proofErr w:type="gramEnd"/>
+      <w:r>
+        <w:t xml:space="preserve"> schauen wir mal zum nächsten. Hier hat wieder Tabelle gebildet, diesmal mit drei Spalten. Ich </w:t>
+      </w:r>
+      <w:proofErr w:type="gramStart"/>
+      <w:r>
+        <w:t>ist</w:t>
+      </w:r>
+      <w:proofErr w:type="gramEnd"/>
+      <w:r>
+        <w:t xml:space="preserve"> die erste Tabelle, die ich jetzt hier gesehen habe, mit zwei Spalten, äh drei Spalten.</w:t>
+      </w:r>
+    </w:p>
+    <w:p>
+      <w:r>
+        <w:t xml:space="preserve">Und es sieht dann ja ganz interessant aus, </w:t>
+      </w:r>
+      <w:proofErr w:type="gramStart"/>
+      <w:r>
+        <w:t>weil</w:t>
+      </w:r>
+      <w:proofErr w:type="gramEnd"/>
+      <w:r>
+        <w:t xml:space="preserve"> er bin gespannt, </w:t>
+      </w:r>
+      <w:proofErr w:type="gramStart"/>
+      <w:r>
+        <w:t>weil</w:t>
+      </w:r>
+      <w:proofErr w:type="gramEnd"/>
+      <w:r>
+        <w:t xml:space="preserve"> es gibt eigentlich mehr Werte und er hat anscheinend viele ausgeschlossen.</w:t>
       </w:r>
     </w:p>
     <w:p>
@@ -658,7 +1330,15 @@
     </w:p>
     <w:p>
       <w:r>
-        <w:t>Also wäre das hier entsprechender Tabelleintrag und WLT40-Umgebung kommt nicht vor. Und ich schätze mal, dass hier das Problem ist, weshalb es nicht die Tabelle geschafft hat.</w:t>
+        <w:t xml:space="preserve">Also wäre das hier entsprechender </w:t>
+      </w:r>
+      <w:proofErr w:type="spellStart"/>
+      <w:r>
+        <w:t>Tabelleintrag</w:t>
+      </w:r>
+      <w:proofErr w:type="spellEnd"/>
+      <w:r>
+        <w:t xml:space="preserve"> und WLT40-Umgebung kommt nicht vor. Und ich schätze mal, dass hier das Problem ist, weshalb es nicht die Tabelle geschafft hat.</w:t>
       </w:r>
     </w:p>
     <w:p>
@@ -673,17 +1353,41 @@
     </w:p>
     <w:p>
       <w:r>
-        <w:t>Hier gescheitert ist also rein von der, ja, muss eigentlich so sein, denke ich mal, weil die haben alle eine erfüllbare Bedingung, die ja quasi bei allen gleich aufgebaut ist.</w:t>
-      </w:r>
-    </w:p>
-    <w:p>
-      <w:r>
-        <w:t>So, ich glaube, das PS, überspringe ich, weil das ist wieder schwer greifbar. Schauen wir uns lieber einfachere Merkmale an.</w:t>
-      </w:r>
-    </w:p>
-    <w:p>
-      <w:r>
-        <w:t>Das ist auch ein blödsmerkmal, FDAF, äh, F-A-A-D, pardon. So, schauen wir mal zu S, VLT40STUFB. Okay, ja, es gibt vier Werte und, ja, das haben wir uns vorher schon angeschaut, genau, da würde nur der Wert 7016 überbleiben, gleiches Farben wie vorher, bei WL, PS, FP14 ist das gleiche, ich denke, diese ganzen FP, glaube ich, sind Farbmerkmale, die fallen sich alle gleich, denke ich, wenn wir uns dieses WL, T, W, E, P, FP vielleicht machen, ich finde es auch ganz interessant, dass er sich eben dann, komplett auf die, auf die Werte mit Bedingungen konzentriert,</w:t>
+        <w:t xml:space="preserve">Hier gescheitert ist also rein von der, ja, muss eigentlich so sein, denke ich mal, </w:t>
+      </w:r>
+      <w:proofErr w:type="gramStart"/>
+      <w:r>
+        <w:t>weil</w:t>
+      </w:r>
+      <w:proofErr w:type="gramEnd"/>
+      <w:r>
+        <w:t xml:space="preserve"> die haben alle eine erfüllbare Bedingung, die ja quasi bei allen gleich aufgebaut ist.</w:t>
+      </w:r>
+    </w:p>
+    <w:p>
+      <w:r>
+        <w:t xml:space="preserve">So, ich glaube, das PS, überspringe ich, </w:t>
+      </w:r>
+      <w:proofErr w:type="gramStart"/>
+      <w:r>
+        <w:t>weil</w:t>
+      </w:r>
+      <w:proofErr w:type="gramEnd"/>
+      <w:r>
+        <w:t xml:space="preserve"> das ist wieder schwer greifbar. Schauen wir uns lieber einfachere Merkmale an.</w:t>
+      </w:r>
+    </w:p>
+    <w:p>
+      <w:r>
+        <w:t xml:space="preserve">Das ist auch ein </w:t>
+      </w:r>
+      <w:proofErr w:type="spellStart"/>
+      <w:r>
+        <w:t>blödsmerkmal</w:t>
+      </w:r>
+      <w:proofErr w:type="spellEnd"/>
+      <w:r>
+        <w:t>, FDAF, äh, F-A-A-D, pardon. So, schauen wir mal zu S, VLT40STUFB. Okay, ja, es gibt vier Werte und, ja, das haben wir uns vorher schon angeschaut, genau, da würde nur der Wert 7016 überbleiben, gleiches Farben wie vorher, bei WL, PS, FP14 ist das gleiche, ich denke, diese ganzen FP, glaube ich, sind Farbmerkmale, die fallen sich alle gleich, denke ich, wenn wir uns dieses WL, T, W, E, P, FP vielleicht machen, ich finde es auch ganz interessant, dass er sich eben dann, komplett auf die, auf die Werte mit Bedingungen konzentriert,</w:t>
       </w:r>
     </w:p>
     <w:p>
@@ -693,7 +1397,15 @@
     </w:p>
     <w:p>
       <w:r>
-        <w:t>Also es muss dann drinstehen, zum Beispiel, dass wir im Befehl zum Beispiel machen, also 2004, 2008 und so weiter, also Werte auch, die keinerlei Bedingungen haben, das heißt, dass sie sind gültig und entsprechend</w:t>
+        <w:t xml:space="preserve">Also es muss dann drinstehen, zum Beispiel, dass wir im Befehl zum Beispiel machen, also 2004, 2008 und so weiter, also Werte auch, die keinerlei Bedingungen haben, das heißt, dass sie </w:t>
+      </w:r>
+      <w:proofErr w:type="gramStart"/>
+      <w:r>
+        <w:t>sind</w:t>
+      </w:r>
+      <w:proofErr w:type="gramEnd"/>
+      <w:r>
+        <w:t xml:space="preserve"> gültig und entsprechend</w:t>
       </w:r>
     </w:p>
     <w:p>
@@ -702,27 +1414,107 @@
       </w:r>
       <w:r>
         <w:lastRenderedPageBreak/>
-        <w:t>es ohne Tabelle ist, also diese Entscheidung No Table, dann müssten die Werte ohne Bedingung quasi hier aufgeführt werden.</w:t>
-      </w:r>
-    </w:p>
-    <w:p>
-      <w:r>
-        <w:t>Genau. Schauen wir weiter. Also, ich möchte mal schauen, ob es dieses Merkmal hier gibt, aber ich glaube schon, naja genau, es gibt es auch, okay, also es hat er nicht so insofern auch gut übernommen, klar, dieses Unclassified Währung, der Wert 2 muss komplett rausfliegen, die anderen hat eigentlich richtig übernommen und da ist jetzt auch ein Problem drin, was so direkt nicht übersetzbar ist tatsächlich, und zwar dieses, da steht ja wirklich in der Syntax not specific, sie pfällt.</w:t>
-      </w:r>
-    </w:p>
-    <w:p>
-      <w:r>
-        <w:t>WLT40-Umgebung, und das ist wirklich ein Fall, der müsste irgendwie von Hand vom Modellierer gelöst werden, weil das Problem ist, Not Specified ist kein zulässiger Begriff in Constraints, das kann nicht abgefragt werden, Constraints quasi kann nur auf Specified abgefragt werden, und Not Specified ist quasi weder in Tabellen möglich, als auch in Constraints direkt, weil man darf auch in den Tabellen kein Feld leer lassen.</w:t>
-      </w:r>
-    </w:p>
-    <w:p>
-      <w:r>
-        <w:t>Warum steht dann jetzt hier Not Specified? ist vermutlich, dass die so gearbeitet haben, dass ohne Wert, also Not Specified heißt, also nein ohne oder Standard, und nur wenn man Wert einträgt, ähm,</w:t>
-      </w:r>
-    </w:p>
-    <w:p>
-      <w:r>
-        <w:t>Dann ist der Sonderfall eingetroffen bei dieser WLT40-Umgebung und so hat man früher modellieren können und anstatt diesem Leerlassen für den Standard, müssen wir jetzt quasi einen Wert einführen, der für Standard steht und das ist quasi ein Fall hier, der kann nie direkt so in einer Tabelle oder Konzern übersetzt werden, also da, das ist jetzt wirklich ein Sonderfall, der muss, ja, da muss neuer Wert erzeugt werden vermutlich und das Modell insgesamt angepasst werden, also nichts, was dieses Tool automatisiert lösen kann direkt, da müsste höchstens dann eine Warnung kommen, von wegen, ja, hier ist ein klassifiziertes Merkmal, was auf NotSpecified abgefragt wird, das müsste dann quasi in so einen Review-Toppel</w:t>
+        <w:t xml:space="preserve">es ohne Tabelle ist, also diese Entscheidung </w:t>
+      </w:r>
+      <w:proofErr w:type="spellStart"/>
+      <w:r>
+        <w:t>No</w:t>
+      </w:r>
+      <w:proofErr w:type="spellEnd"/>
+      <w:r>
+        <w:t xml:space="preserve"> Table, dann müssten die Werte ohne Bedingung quasi hier aufgeführt werden.</w:t>
+      </w:r>
+    </w:p>
+    <w:p>
+      <w:r>
+        <w:t xml:space="preserve">Genau. Schauen wir weiter. Also, ich möchte mal schauen, ob es dieses Merkmal hier gibt, aber ich glaube schon, naja genau, es gibt es auch, okay, also es hat er nicht so insofern auch gut übernommen, klar, dieses </w:t>
+      </w:r>
+      <w:proofErr w:type="spellStart"/>
+      <w:r>
+        <w:t>Unclassified</w:t>
+      </w:r>
+      <w:proofErr w:type="spellEnd"/>
+      <w:r>
+        <w:t xml:space="preserve"> Währung, der Wert 2 muss komplett rausfliegen, die anderen hat eigentlich richtig übernommen und da ist jetzt auch ein Problem drin, was so direkt nicht übersetzbar ist tatsächlich, und zwar dieses, da steht ja wirklich in der Syntax not </w:t>
+      </w:r>
+      <w:proofErr w:type="spellStart"/>
+      <w:r>
+        <w:t>specific</w:t>
+      </w:r>
+      <w:proofErr w:type="spellEnd"/>
+      <w:r>
+        <w:t xml:space="preserve">, sie </w:t>
+      </w:r>
+      <w:proofErr w:type="spellStart"/>
+      <w:r>
+        <w:t>pfällt</w:t>
+      </w:r>
+      <w:proofErr w:type="spellEnd"/>
+      <w:r>
+        <w:t>.</w:t>
+      </w:r>
+    </w:p>
+    <w:p>
+      <w:r>
+        <w:t xml:space="preserve">WLT40-Umgebung, und das ist wirklich ein Fall, der müsste irgendwie von Hand vom Modellierer gelöst werden, weil das Problem ist, Not </w:t>
+      </w:r>
+      <w:proofErr w:type="spellStart"/>
+      <w:r>
+        <w:t>Specified</w:t>
+      </w:r>
+      <w:proofErr w:type="spellEnd"/>
+      <w:r>
+        <w:t xml:space="preserve"> ist kein zulässiger Begriff in Constraints, das kann nicht abgefragt werden, Constraints quasi kann nur auf </w:t>
+      </w:r>
+      <w:proofErr w:type="spellStart"/>
+      <w:r>
+        <w:t>Specified</w:t>
+      </w:r>
+      <w:proofErr w:type="spellEnd"/>
+      <w:r>
+        <w:t xml:space="preserve"> abgefragt werden, und Not </w:t>
+      </w:r>
+      <w:proofErr w:type="spellStart"/>
+      <w:r>
+        <w:t>Specified</w:t>
+      </w:r>
+      <w:proofErr w:type="spellEnd"/>
+      <w:r>
+        <w:t xml:space="preserve"> ist quasi weder in Tabellen möglich, als auch in Constraints direkt, weil man darf auch in den Tabellen kein Feld leer lassen.</w:t>
+      </w:r>
+    </w:p>
+    <w:p>
+      <w:r>
+        <w:t xml:space="preserve">Warum steht dann jetzt hier Not </w:t>
+      </w:r>
+      <w:proofErr w:type="spellStart"/>
+      <w:r>
+        <w:t>Specified</w:t>
+      </w:r>
+      <w:proofErr w:type="spellEnd"/>
+      <w:r>
+        <w:t xml:space="preserve">? ist vermutlich, dass die so gearbeitet haben, dass ohne Wert, also Not </w:t>
+      </w:r>
+      <w:proofErr w:type="spellStart"/>
+      <w:r>
+        <w:t>Specified</w:t>
+      </w:r>
+      <w:proofErr w:type="spellEnd"/>
+      <w:r>
+        <w:t xml:space="preserve"> heißt, also nein ohne oder Standard, und nur wenn man Wert einträgt, ähm,</w:t>
+      </w:r>
+    </w:p>
+    <w:p>
+      <w:r>
+        <w:t xml:space="preserve">Dann ist der Sonderfall eingetroffen bei dieser WLT40-Umgebung und so hat man früher modellieren können und anstatt diesem Leerlassen für den Standard, müssen wir jetzt quasi einen Wert einführen, der für Standard steht und das ist quasi ein Fall hier, der kann nie direkt so in einer Tabelle oder Konzern übersetzt werden, also da, das ist jetzt wirklich ein Sonderfall, der muss, ja, da muss neuer Wert erzeugt werden vermutlich und das Modell insgesamt angepasst werden, also nichts, was dieses Tool automatisiert lösen kann direkt, da müsste höchstens dann eine Warnung kommen, von wegen, ja, hier ist ein klassifiziertes Merkmal, was auf </w:t>
+      </w:r>
+      <w:proofErr w:type="spellStart"/>
+      <w:r>
+        <w:t>NotSpecified</w:t>
+      </w:r>
+      <w:proofErr w:type="spellEnd"/>
+      <w:r>
+        <w:t xml:space="preserve"> abgefragt wird, das müsste dann quasi in so einen Review-Toppel</w:t>
       </w:r>
     </w:p>
     <w:p>
@@ -737,12 +1529,36 @@
     </w:p>
     <w:p>
       <w:r>
-        <w:t>Okay, da hat er das jetzt aber vertan, weil der hat Specified Weren drin. Also der 5, der sollte eigentlich gar nicht dabei sein.</w:t>
-      </w:r>
-    </w:p>
-    <w:p>
-      <w:r>
-        <w:t>Und 8 hat er noch den Letzten. Der 8, der ist wahrscheinlich richtig, der fragt zwei Merkmale, hat spmod3. spfstt1, den hat er richtig gemacht, und jetzt ist halt die Frage was es mit denen dazwischen und jetzt mal schaut, der als Bestwertwertwertwertung, hat raus, der hätte jetzt den Wert 1, der hat jetzt eigentlich nur eine Bedingung, aus WLSP FST ungleich 1.</w:t>
+        <w:t xml:space="preserve">Okay, da hat er das jetzt aber vertan, weil der </w:t>
+      </w:r>
+      <w:proofErr w:type="gramStart"/>
+      <w:r>
+        <w:t>hat</w:t>
+      </w:r>
+      <w:proofErr w:type="gramEnd"/>
+      <w:r>
+        <w:t xml:space="preserve"> </w:t>
+      </w:r>
+      <w:proofErr w:type="spellStart"/>
+      <w:r>
+        <w:t>Specified</w:t>
+      </w:r>
+      <w:proofErr w:type="spellEnd"/>
+      <w:r>
+        <w:t xml:space="preserve"> Weren drin. Also der 5, der sollte eigentlich gar nicht dabei sein.</w:t>
+      </w:r>
+    </w:p>
+    <w:p>
+      <w:r>
+        <w:t xml:space="preserve">Und 8 hat er noch den Letzten. Der 8, der ist wahrscheinlich richtig, der fragt zwei Merkmale, hat spmod3. spfstt1, den hat er richtig gemacht, und jetzt ist halt </w:t>
+      </w:r>
+      <w:proofErr w:type="gramStart"/>
+      <w:r>
+        <w:t>die Frage</w:t>
+      </w:r>
+      <w:proofErr w:type="gramEnd"/>
+      <w:r>
+        <w:t xml:space="preserve"> was es mit denen dazwischen und jetzt mal schaut, der als Bestwertwertwertwertung, hat raus, der hätte jetzt den Wert 1, der hat jetzt eigentlich nur eine Bedingung, aus WLSP FST ungleich 1.</w:t>
       </w:r>
     </w:p>
     <w:p>
@@ -783,7 +1599,15 @@
     </w:p>
     <w:p>
       <w:r>
-        <w:t>Ah, da ist wieder interessant, da hat wieder Master geschrieben, es gibt sicher kein Map, mal ein Master, jetzt schauen wir mal, wo es den Wert gibt, es wird sicher dieses WLSP, PS sein, oder?</w:t>
+        <w:t xml:space="preserve">Ah, da ist wieder interessant, da hat wieder Master geschrieben, es gibt sicher kein </w:t>
+      </w:r>
+      <w:proofErr w:type="spellStart"/>
+      <w:r>
+        <w:t>Map</w:t>
+      </w:r>
+      <w:proofErr w:type="spellEnd"/>
+      <w:r>
+        <w:t>, mal ein Master, jetzt schauen wir mal, wo es den Wert gibt, es wird sicher dieses WLSP, PS sein, oder?</w:t>
       </w:r>
     </w:p>
     <w:p>
@@ -793,7 +1617,15 @@
     </w:p>
     <w:p>
       <w:r>
-        <w:t>Wahrscheinlich wird es dieses Merkmal sein, weil da SP noch drin verkommt. Aber WLSP Master muss WLSP PS sein. Da gibt es ja quasi nur die beiden Werte.</w:t>
+        <w:t xml:space="preserve">Wahrscheinlich wird es dieses Merkmal sein, weil da SP noch drin verkommt. Aber WLSP Master muss WLSP PS sein. Da gibt es </w:t>
+      </w:r>
+      <w:proofErr w:type="gramStart"/>
+      <w:r>
+        <w:t>ja quasi</w:t>
+      </w:r>
+      <w:proofErr w:type="gramEnd"/>
+      <w:r>
+        <w:t xml:space="preserve"> nur die beiden Werte.</w:t>
       </w:r>
     </w:p>
     <w:p>
@@ -803,7 +1635,15 @@
     </w:p>
     <w:p>
       <w:r>
-        <w:t>Mal schauen, da gibt es jetzt 2, 3, 4. Das war ja wirklich der Wert 0,0, oder? Genau so, das ist richtig.</w:t>
+        <w:t xml:space="preserve">Mal schauen, da gibt es jetzt 2, 3, 4. Das war </w:t>
+      </w:r>
+      <w:proofErr w:type="gramStart"/>
+      <w:r>
+        <w:t>ja wirklich</w:t>
+      </w:r>
+      <w:proofErr w:type="gramEnd"/>
+      <w:r>
+        <w:t xml:space="preserve"> der Wert 0,0, oder? Genau so, das ist richtig.</w:t>
       </w:r>
     </w:p>
     <w:p>
@@ -819,17 +1659,49 @@
     <w:p>
       <w:r>
         <w:lastRenderedPageBreak/>
-        <w:t>Tatsächlich taucht da noch ein weiteres Merkmal hier auf. Schauen wir mal, ob es WLSPKO2 irgendwo gibt hier. Aha, das gibt es, also die Spalte fehlt quasi.</w:t>
-      </w:r>
-    </w:p>
-    <w:p>
-      <w:r>
-        <w:t>Ja genau, so sieht es da aus. Mal hier. Einige Specified-Wertungen, die sollten nicht vorkommen. Na gut, tatsächlich, da ist der Wert 21.</w:t>
-      </w:r>
-    </w:p>
-    <w:p>
-      <w:r>
-        <w:t>Mal schauen, hat der noch? Genau, das ist zwar richtig, aber gleichzeitig hat der Wert 21 Specified-Wertungen gesehen. Und dieses Merkmal, glaube ich, so weiters gesehen haben, ist auch Teil, also VLSP, EMOD, ist Teil des Modells, also wer hier müsste eigentlich auch mit den Tabellen rein.</w:t>
+        <w:t xml:space="preserve">Tatsächlich taucht da noch ein weiteres Merkmal hier auf. Schauen wir mal, ob es WLSPKO2 irgendwo </w:t>
+      </w:r>
+      <w:proofErr w:type="gramStart"/>
+      <w:r>
+        <w:t>gibt</w:t>
+      </w:r>
+      <w:proofErr w:type="gramEnd"/>
+      <w:r>
+        <w:t xml:space="preserve"> hier. Aha, das gibt es, also die Spalte </w:t>
+      </w:r>
+      <w:proofErr w:type="gramStart"/>
+      <w:r>
+        <w:t>fehlt quasi</w:t>
+      </w:r>
+      <w:proofErr w:type="gramEnd"/>
+      <w:r>
+        <w:t>.</w:t>
+      </w:r>
+    </w:p>
+    <w:p>
+      <w:r>
+        <w:t xml:space="preserve">Ja genau, so sieht es da aus. Mal hier. Einige </w:t>
+      </w:r>
+      <w:proofErr w:type="spellStart"/>
+      <w:r>
+        <w:t>Specified</w:t>
+      </w:r>
+      <w:proofErr w:type="spellEnd"/>
+      <w:r>
+        <w:t>-Wertungen, die sollten nicht vorkommen. Na gut, tatsächlich, da ist der Wert 21.</w:t>
+      </w:r>
+    </w:p>
+    <w:p>
+      <w:r>
+        <w:t xml:space="preserve">Mal schauen, hat der noch? Genau, das ist zwar richtig, aber gleichzeitig hat der Wert 21 </w:t>
+      </w:r>
+      <w:proofErr w:type="spellStart"/>
+      <w:r>
+        <w:t>Specified</w:t>
+      </w:r>
+      <w:proofErr w:type="spellEnd"/>
+      <w:r>
+        <w:t>-Wertungen gesehen. Und dieses Merkmal, glaube ich, so weiters gesehen haben, ist auch Teil, also VLSP, EMOD, ist Teil des Modells, also wer hier müsste eigentlich auch mit den Tabellen rein.</w:t>
       </w:r>
     </w:p>
     <w:p>
@@ -839,7 +1711,23 @@
     </w:p>
     <w:p>
       <w:r>
-        <w:t>Was ich jetzt bemängelt habe, dass hier dieses SVLSP EMOD fehlt. Das taucht hier jetzt in der anderen auf, mhm, mhm, okay, das ist ja dann schon mal gut, das einzige Problem dabei ist, er erzielt daraus ein bisschen die falschen Rückschlüsse, weil wenn ich jetzt eine Tabelle so hätte und die andere Tabelle mit den Werkmalen, dann wäre nur die Schnittmenge aus beiden Tabellen wäre der gültige Wertevorrat und das würde dann bedeuten, dass mir im Endeffekt kein Wert überbleibt und von dem her müsst ihr eigentlich beides in eine Tabelle verheiratet werden und die Lücken müssen eben mit Wildcards gefüllt werden, so ist eben wie die SAP Constraint Engine die Werte einschränkt und ja, nur so hatte ich meinen gültigen Wertevorrat.</w:t>
+        <w:t xml:space="preserve">Was ich jetzt bemängelt habe, dass hier dieses SVLSP EMOD fehlt. Das taucht hier jetzt in der anderen auf, </w:t>
+      </w:r>
+      <w:proofErr w:type="spellStart"/>
+      <w:r>
+        <w:t>mhm</w:t>
+      </w:r>
+      <w:proofErr w:type="spellEnd"/>
+      <w:r>
+        <w:t xml:space="preserve">, </w:t>
+      </w:r>
+      <w:proofErr w:type="spellStart"/>
+      <w:r>
+        <w:t>mhm</w:t>
+      </w:r>
+      <w:proofErr w:type="spellEnd"/>
+      <w:r>
+        <w:t>, okay, das ist ja dann schon mal gut, das einzige Problem dabei ist, er erzielt daraus ein bisschen die falschen Rückschlüsse, weil wenn ich jetzt eine Tabelle so hätte und die andere Tabelle mit den Werkmalen, dann wäre nur die Schnittmenge aus beiden Tabellen wäre der gültige Wertevorrat und das würde dann bedeuten, dass mir im Endeffekt kein Wert überbleibt und von dem her müsst ihr eigentlich beides in eine Tabelle verheiratet werden und die Lücken müssen eben mit Wildcards gefüllt werden, so ist eben wie die SAP Constraint Engine die Werte einschränkt und ja, nur so hatte ich meinen gültigen Wertevorrat.</w:t>
       </w:r>
     </w:p>
     <w:p>
@@ -854,12 +1742,44 @@
     </w:p>
     <w:p>
       <w:r>
-        <w:t>Aber ja, so, gehen wir zum Letzten. Fathom, Fathom, Fathom, Fathom. Das Master Mager, was das sein könnte. Das ist wieder schwer greifbar, kein guter Merkmalsname drin steht, auf den man sich beziehen könnte.</w:t>
-      </w:r>
-    </w:p>
-    <w:p>
-      <w:r>
-        <w:t>Aber eben... Ich glaube, da komme ich jetzt mal wirklich nicht drauf, welches Merkmale es sein sollte, da ist jetzt alles zu beliebig mit den numerischen Werte, springen wir mal zum nächsten, wobei es ganz, wobei da nennt er es jetzt als ABL2, da muss ich jetzt fragen, ist das der ABL1, wenn es nacheinander kommt, mal schauen, vielleicht ja, weil es gibt 2, 3 und dann gibt es 0 und 1 und das wäre nicht möglich, also falls du das ist doch real.</w:t>
+        <w:t xml:space="preserve">Aber ja, so, gehen wir zum Letzten. Fathom, Fathom, Fathom, Fathom. Das Master Mager, was das sein könnte. Das ist wieder schwer greifbar, kein guter Merkmalsname </w:t>
+      </w:r>
+      <w:proofErr w:type="gramStart"/>
+      <w:r>
+        <w:t>drin steht</w:t>
+      </w:r>
+      <w:proofErr w:type="gramEnd"/>
+      <w:r>
+        <w:t>, auf den man sich beziehen könnte.</w:t>
+      </w:r>
+    </w:p>
+    <w:p>
+      <w:r>
+        <w:t xml:space="preserve">Aber eben... Ich glaube, da komme ich jetzt mal wirklich nicht drauf, </w:t>
+      </w:r>
+      <w:proofErr w:type="gramStart"/>
+      <w:r>
+        <w:t>welches Merkmale</w:t>
+      </w:r>
+      <w:proofErr w:type="gramEnd"/>
+      <w:r>
+        <w:t xml:space="preserve"> es sein sollte, da ist jetzt alles zu beliebig </w:t>
+      </w:r>
+      <w:proofErr w:type="gramStart"/>
+      <w:r>
+        <w:t>mit den numerischen Werte</w:t>
+      </w:r>
+      <w:proofErr w:type="gramEnd"/>
+      <w:r>
+        <w:t xml:space="preserve">, springen wir mal zum nächsten, wobei es ganz, wobei da nennt er es jetzt als ABL2, da muss ich jetzt fragen, ist das der ABL1, wenn es nacheinander kommt, mal schauen, vielleicht ja, weil es </w:t>
+      </w:r>
+      <w:proofErr w:type="gramStart"/>
+      <w:r>
+        <w:t>gibt</w:t>
+      </w:r>
+      <w:proofErr w:type="gramEnd"/>
+      <w:r>
+        <w:t xml:space="preserve"> 2, 3 und dann gibt es 0 und 1 und das wäre nicht möglich, also falls du das ist doch real.</w:t>
       </w:r>
     </w:p>
     <w:p>
@@ -868,12 +1788,36 @@
       </w:r>
       <w:r>
         <w:lastRenderedPageBreak/>
-        <w:t>wieder Specified Währung übersehen, also sind die Werte eigentlich raus, und die anderen beiden, die bekommen jetzt auch nicht wirklich ein, Aber schauen wir mal dann, das zweite bleibt</w:t>
-      </w:r>
-    </w:p>
-    <w:p>
-      <w:r>
-        <w:t>Die hat er da richtig drin. Also das zweite Platz sind quasi die unteren beiden Werte von WL, HPW, ABL.</w:t>
+        <w:t xml:space="preserve">wieder </w:t>
+      </w:r>
+      <w:proofErr w:type="spellStart"/>
+      <w:r>
+        <w:t>Specified</w:t>
+      </w:r>
+      <w:proofErr w:type="spellEnd"/>
+      <w:r>
+        <w:t xml:space="preserve"> Währung übersehen, also sind die Werte eigentlich raus, und die anderen beiden, die bekommen jetzt auch nicht wirklich ein, Aber schauen wir mal dann, das zweite bleibt</w:t>
+      </w:r>
+    </w:p>
+    <w:p>
+      <w:r>
+        <w:t xml:space="preserve">Die hat er da richtig drin. Also </w:t>
+      </w:r>
+      <w:proofErr w:type="gramStart"/>
+      <w:r>
+        <w:t>das zweite Platz</w:t>
+      </w:r>
+      <w:proofErr w:type="gramEnd"/>
+      <w:r>
+        <w:t xml:space="preserve"> </w:t>
+      </w:r>
+      <w:proofErr w:type="gramStart"/>
+      <w:r>
+        <w:t>sind quasi</w:t>
+      </w:r>
+      <w:proofErr w:type="gramEnd"/>
+      <w:r>
+        <w:t xml:space="preserve"> die unteren beiden Werte von WL, HPW, ABL.</w:t>
       </w:r>
     </w:p>
     <w:p>
@@ -883,7 +1827,15 @@
     </w:p>
     <w:p>
       <w:r>
-        <w:t>Und eben in der ersten Tabelle, eben die Halluzinationen, die beiden unteren Zeilen sind auch nicht richtig. Beziehungsweise die erste Tabelle dürfte es ja gar nicht geben, weil die beiden Werte, die drin sind, die es wirklich gibt, sind eigentlich über Specified Währung ausgeschlossen.</w:t>
+        <w:t xml:space="preserve">Und eben in der ersten Tabelle, eben die Halluzinationen, die beiden unteren Zeilen sind auch nicht richtig. Beziehungsweise die erste Tabelle dürfte es ja gar nicht geben, weil die beiden Werte, die drin sind, die es wirklich gibt, sind eigentlich über </w:t>
+      </w:r>
+      <w:proofErr w:type="spellStart"/>
+      <w:r>
+        <w:t>Specified</w:t>
+      </w:r>
+      <w:proofErr w:type="spellEnd"/>
+      <w:r>
+        <w:t xml:space="preserve"> Währung ausgeschlossen.</w:t>
       </w:r>
     </w:p>
     <w:p>
@@ -934,21 +1886,74 @@
           <w:b/>
           <w:bCs/>
         </w:rPr>
-        <w:t>Torben Dörrer (Unverified)</w:t>
-      </w:r>
-    </w:p>
-    <w:p>
-      <w:r>
-        <w:t xml:space="preserve">Jetzt habe ich zum Abschluss eigentlich nochmal vier einfach Standalone-Fragen jetzt für dich. Und zwar das Erste, nachdem du dir jetzt alles angeschaut hast, also ich habe </w:t>
+        <w:t>Torben Dörrer (</w:t>
+      </w:r>
+      <w:proofErr w:type="spellStart"/>
+      <w:r>
+        <w:rPr>
+          <w:b/>
+          <w:bCs/>
+        </w:rPr>
+        <w:t>Unverified</w:t>
+      </w:r>
+      <w:proofErr w:type="spellEnd"/>
+      <w:r>
+        <w:rPr>
+          <w:b/>
+          <w:bCs/>
+        </w:rPr>
+        <w:t>)</w:t>
+      </w:r>
+    </w:p>
+    <w:p>
+      <w:r>
+        <w:t xml:space="preserve">Jetzt habe ich zum </w:t>
+      </w:r>
+      <w:proofErr w:type="gramStart"/>
+      <w:r>
+        <w:t>Abschluss eigentlich</w:t>
+      </w:r>
+      <w:proofErr w:type="gramEnd"/>
+      <w:r>
+        <w:t xml:space="preserve"> nochmal vier einfach </w:t>
+      </w:r>
+      <w:proofErr w:type="spellStart"/>
+      <w:r>
+        <w:t>Standalone</w:t>
+      </w:r>
+      <w:proofErr w:type="spellEnd"/>
+      <w:r>
+        <w:t xml:space="preserve">-Fragen jetzt für dich. Und zwar das Erste, nachdem du dir jetzt alles angeschaut hast, also ich habe </w:t>
       </w:r>
       <w:r>
         <w:lastRenderedPageBreak/>
-        <w:t>jetzt gesehen, du hast es eigentlich gar nicht genutzt, aber auch wie gut konntest du jetzt anhand der Notizen dieses Architekten nachvollziehen, warum jetzt irgendwie aus dem alten Code eine Tabelle oder ein If-Statement generiert wurde und was wäre für dich Verbesserung an diese Notizen?</w:t>
-      </w:r>
-    </w:p>
-    <w:p>
-      <w:r>
-        <w:t>Genau so diese Herleitung.</w:t>
+        <w:t xml:space="preserve">jetzt gesehen, du hast es eigentlich gar nicht genutzt, aber auch wie gut konntest du jetzt anhand der Notizen dieses Architekten nachvollziehen, warum </w:t>
+      </w:r>
+      <w:proofErr w:type="gramStart"/>
+      <w:r>
+        <w:t>jetzt irgendwie</w:t>
+      </w:r>
+      <w:proofErr w:type="gramEnd"/>
+      <w:r>
+        <w:t xml:space="preserve"> aus dem alten Code eine Tabelle oder ein </w:t>
+      </w:r>
+      <w:proofErr w:type="spellStart"/>
+      <w:r>
+        <w:t>If</w:t>
+      </w:r>
+      <w:proofErr w:type="spellEnd"/>
+      <w:r>
+        <w:t>-Statement generiert wurde und was wäre für dich Verbesserung an diese Notizen?</w:t>
+      </w:r>
+    </w:p>
+    <w:p>
+      <w:proofErr w:type="spellStart"/>
+      <w:r>
+        <w:t>Genau so</w:t>
+      </w:r>
+      <w:proofErr w:type="spellEnd"/>
+      <w:r>
+        <w:t xml:space="preserve"> diese Herleitung.</w:t>
       </w:r>
     </w:p>
     <w:p/>
@@ -969,22 +1974,94 @@
           <w:b/>
           <w:bCs/>
         </w:rPr>
-        <w:t>Tobi Meyer (msg)</w:t>
-      </w:r>
-    </w:p>
-    <w:p>
-      <w:r>
-        <w:t>Also für mich war es jetzt nicht wirklich schlüssig, woraus die Entscheidung Table oder No Table entstanden ist. Also es war, also es hat sich gedeckt, wenn No Table oben stand, dann war tatsächlich keine Tabelle da, aber warum eben nicht?</w:t>
-      </w:r>
-    </w:p>
-    <w:p>
-      <w:r>
-        <w:t>Und es waren ja dann teilweise auch sehr komplexe Bedingungen, die man keinesfalls eigentlich nur als Constraint darstellen sollte, sondern unbedingt als Tabelle, waren hier als No Constraint abgebildet und wobei ich einen Eindruck habe, das kommt eben daher, weil mit den unclassified Merkmale dann irgendwie auf die Schiene kommt No Table, zumindest hat es auf mich so gewirkt.</w:t>
-      </w:r>
-    </w:p>
-    <w:p>
-      <w:r>
-        <w:t>Und Ja, eigentlich sollten ja, ist No-Table-Option, wenn ich eine sehr simple Einschränkung habe.</w:t>
+        <w:t>Tobi Meyer (</w:t>
+      </w:r>
+      <w:proofErr w:type="spellStart"/>
+      <w:r>
+        <w:rPr>
+          <w:b/>
+          <w:bCs/>
+        </w:rPr>
+        <w:t>msg</w:t>
+      </w:r>
+      <w:proofErr w:type="spellEnd"/>
+      <w:r>
+        <w:rPr>
+          <w:b/>
+          <w:bCs/>
+        </w:rPr>
+        <w:t>)</w:t>
+      </w:r>
+    </w:p>
+    <w:p>
+      <w:r>
+        <w:t xml:space="preserve">Also für mich war es jetzt nicht </w:t>
+      </w:r>
+      <w:proofErr w:type="gramStart"/>
+      <w:r>
+        <w:t>wirklich schlüssig</w:t>
+      </w:r>
+      <w:proofErr w:type="gramEnd"/>
+      <w:r>
+        <w:t xml:space="preserve">, woraus die Entscheidung Table oder </w:t>
+      </w:r>
+      <w:proofErr w:type="spellStart"/>
+      <w:r>
+        <w:t>No</w:t>
+      </w:r>
+      <w:proofErr w:type="spellEnd"/>
+      <w:r>
+        <w:t xml:space="preserve"> Table entstanden ist. Also es war, also es hat sich gedeckt, wenn </w:t>
+      </w:r>
+      <w:proofErr w:type="spellStart"/>
+      <w:r>
+        <w:t>No</w:t>
+      </w:r>
+      <w:proofErr w:type="spellEnd"/>
+      <w:r>
+        <w:t xml:space="preserve"> Table oben stand, dann war tatsächlich keine Tabelle da, aber warum eben nicht?</w:t>
+      </w:r>
+    </w:p>
+    <w:p>
+      <w:r>
+        <w:t xml:space="preserve">Und es waren ja dann teilweise auch sehr komplexe Bedingungen, die man keinesfalls eigentlich nur als Constraint darstellen sollte, sondern unbedingt als Tabelle, waren hier als </w:t>
+      </w:r>
+      <w:proofErr w:type="spellStart"/>
+      <w:r>
+        <w:t>No</w:t>
+      </w:r>
+      <w:proofErr w:type="spellEnd"/>
+      <w:r>
+        <w:t xml:space="preserve"> Constraint abgebildet und wobei ich einen Eindruck habe, das kommt eben daher, weil mit den </w:t>
+      </w:r>
+      <w:proofErr w:type="spellStart"/>
+      <w:r>
+        <w:t>unclassified</w:t>
+      </w:r>
+      <w:proofErr w:type="spellEnd"/>
+      <w:r>
+        <w:t xml:space="preserve"> Merkmale dann irgendwie auf die Schiene kommt </w:t>
+      </w:r>
+      <w:proofErr w:type="spellStart"/>
+      <w:r>
+        <w:t>No</w:t>
+      </w:r>
+      <w:proofErr w:type="spellEnd"/>
+      <w:r>
+        <w:t xml:space="preserve"> Table, zumindest hat es auf mich so gewirkt.</w:t>
+      </w:r>
+    </w:p>
+    <w:p>
+      <w:r>
+        <w:t xml:space="preserve">Und Ja, eigentlich sollten ja, ist </w:t>
+      </w:r>
+      <w:proofErr w:type="spellStart"/>
+      <w:r>
+        <w:t>No</w:t>
+      </w:r>
+      <w:proofErr w:type="spellEnd"/>
+      <w:r>
+        <w:t>-Table-Option, wenn ich eine sehr simple Einschränkung habe.</w:t>
       </w:r>
     </w:p>
     <w:p/>
@@ -1005,7 +2082,23 @@
           <w:b/>
           <w:bCs/>
         </w:rPr>
-        <w:t>Torben Dörrer (Unverified)</w:t>
+        <w:t>Torben Dörrer (</w:t>
+      </w:r>
+      <w:proofErr w:type="spellStart"/>
+      <w:r>
+        <w:rPr>
+          <w:b/>
+          <w:bCs/>
+        </w:rPr>
+        <w:t>Unverified</w:t>
+      </w:r>
+      <w:proofErr w:type="spellEnd"/>
+      <w:r>
+        <w:rPr>
+          <w:b/>
+          <w:bCs/>
+        </w:rPr>
+        <w:t>)</w:t>
       </w:r>
     </w:p>
     <w:p>
@@ -1036,7 +2129,23 @@
           <w:b/>
           <w:bCs/>
         </w:rPr>
-        <w:t>Tobi Meyer (msg)</w:t>
+        <w:t>Tobi Meyer (</w:t>
+      </w:r>
+      <w:proofErr w:type="spellStart"/>
+      <w:r>
+        <w:rPr>
+          <w:b/>
+          <w:bCs/>
+        </w:rPr>
+        <w:t>msg</w:t>
+      </w:r>
+      <w:proofErr w:type="spellEnd"/>
+      <w:r>
+        <w:rPr>
+          <w:b/>
+          <w:bCs/>
+        </w:rPr>
+        <w:t>)</w:t>
       </w:r>
     </w:p>
     <w:p>
@@ -1051,7 +2160,15 @@
     </w:p>
     <w:p>
       <w:r>
-        <w:t>Die nutzt einen als Bearbeiter schon mal. Allerdings hat es dann teilweise die falschen Rückschlüsse daraus gezogen. Es ist schwierig zu sagen, ein paar Fehler davon sind jetzt auf halfe noch Hindernis, dass man es produktiv verwenden kann.</w:t>
+        <w:t xml:space="preserve">Die nutzt einen als Bearbeiter schon mal. Allerdings hat es dann teilweise die falschen Rückschlüsse daraus gezogen. Es ist schwierig zu sagen, ein paar Fehler davon sind jetzt auf </w:t>
+      </w:r>
+      <w:proofErr w:type="spellStart"/>
+      <w:r>
+        <w:t>halfe</w:t>
+      </w:r>
+      <w:proofErr w:type="spellEnd"/>
+      <w:r>
+        <w:t xml:space="preserve"> noch Hindernis, dass man es produktiv verwenden kann.</w:t>
       </w:r>
     </w:p>
     <w:p/>
@@ -1072,7 +2189,23 @@
           <w:b/>
           <w:bCs/>
         </w:rPr>
-        <w:t>Torben Dörrer (Unverified)</w:t>
+        <w:t>Torben Dörrer (</w:t>
+      </w:r>
+      <w:proofErr w:type="spellStart"/>
+      <w:r>
+        <w:rPr>
+          <w:b/>
+          <w:bCs/>
+        </w:rPr>
+        <w:t>Unverified</w:t>
+      </w:r>
+      <w:proofErr w:type="spellEnd"/>
+      <w:r>
+        <w:rPr>
+          <w:b/>
+          <w:bCs/>
+        </w:rPr>
+        <w:t>)</w:t>
       </w:r>
     </w:p>
     <w:p>
@@ -1098,12 +2231,36 @@
           <w:b/>
           <w:bCs/>
         </w:rPr>
-        <w:t>Tobi Meyer (msg)</w:t>
-      </w:r>
-    </w:p>
-    <w:p>
-      <w:r>
-        <w:t>Ja, genau. So denke ich, kann man es zusammenfassen. Was wären für dich jetzt? Nein, red du erst noch gerne.</w:t>
+        <w:t>Tobi Meyer (</w:t>
+      </w:r>
+      <w:proofErr w:type="spellStart"/>
+      <w:r>
+        <w:rPr>
+          <w:b/>
+          <w:bCs/>
+        </w:rPr>
+        <w:t>msg</w:t>
+      </w:r>
+      <w:proofErr w:type="spellEnd"/>
+      <w:r>
+        <w:rPr>
+          <w:b/>
+          <w:bCs/>
+        </w:rPr>
+        <w:t>)</w:t>
+      </w:r>
+    </w:p>
+    <w:p>
+      <w:r>
+        <w:t xml:space="preserve">Ja, genau. So denke ich, kann man es zusammenfassen. Was wären für dich jetzt? Nein, </w:t>
+      </w:r>
+      <w:proofErr w:type="spellStart"/>
+      <w:r>
+        <w:t>red</w:t>
+      </w:r>
+      <w:proofErr w:type="spellEnd"/>
+      <w:r>
+        <w:t xml:space="preserve"> du erst noch gerne.</w:t>
       </w:r>
     </w:p>
     <w:p>
@@ -1129,7 +2286,23 @@
           <w:b/>
           <w:bCs/>
         </w:rPr>
-        <w:t>Torben Dörrer (Unverified)</w:t>
+        <w:t>Torben Dörrer (</w:t>
+      </w:r>
+      <w:proofErr w:type="spellStart"/>
+      <w:r>
+        <w:rPr>
+          <w:b/>
+          <w:bCs/>
+        </w:rPr>
+        <w:t>Unverified</w:t>
+      </w:r>
+      <w:proofErr w:type="spellEnd"/>
+      <w:r>
+        <w:rPr>
+          <w:b/>
+          <w:bCs/>
+        </w:rPr>
+        <w:t>)</w:t>
       </w:r>
     </w:p>
     <w:p>
@@ -1155,7 +2328,23 @@
           <w:b/>
           <w:bCs/>
         </w:rPr>
-        <w:t>Tobi Meyer (msg)</w:t>
+        <w:t>Tobi Meyer (</w:t>
+      </w:r>
+      <w:proofErr w:type="spellStart"/>
+      <w:r>
+        <w:rPr>
+          <w:b/>
+          <w:bCs/>
+        </w:rPr>
+        <w:t>msg</w:t>
+      </w:r>
+      <w:proofErr w:type="spellEnd"/>
+      <w:r>
+        <w:rPr>
+          <w:b/>
+          <w:bCs/>
+        </w:rPr>
+        <w:t>)</w:t>
       </w:r>
     </w:p>
     <w:p>
@@ -1165,7 +2354,23 @@
     </w:p>
     <w:p>
       <w:r>
-        <w:t>Also das könnte eigentlich beliebig granular sein, dann würde ja für jeden sehen, was ist und ihr müsst dabei dann eben auch die Werte ohne Bedingungen zum Beispiel aufführen und dann müsst ihr sagen, Wert 70, 16 jetzt bei dem, was wir gerade sehen, ist immer gültig und entsprechend müsst ihr dann als Konsequenz heraus, den Wert auch in die Tabelle aufnehmen und alle Bedingungen spalten, wenn sie es mit der Widecard versehen, also so müsste dann quasi die Logik sein und ja, wie war die Frage?</w:t>
+        <w:t xml:space="preserve">Also das </w:t>
+      </w:r>
+      <w:proofErr w:type="gramStart"/>
+      <w:r>
+        <w:t>könnte eigentlich</w:t>
+      </w:r>
+      <w:proofErr w:type="gramEnd"/>
+      <w:r>
+        <w:t xml:space="preserve"> beliebig granular sein, dann würde ja für jeden sehen, was ist und ihr müsst dabei dann eben auch die Werte ohne Bedingungen zum Beispiel aufführen und dann müsst ihr sagen, Wert 70, 16 jetzt bei dem, was wir gerade sehen, ist immer gültig und entsprechend müsst ihr dann als Konsequenz heraus, den Wert auch in die Tabelle aufnehmen und alle Bedingungen spalten, wenn sie es mit der </w:t>
+      </w:r>
+      <w:proofErr w:type="spellStart"/>
+      <w:r>
+        <w:t>Widecard</w:t>
+      </w:r>
+      <w:proofErr w:type="spellEnd"/>
+      <w:r>
+        <w:t xml:space="preserve"> versehen, also so müsste dann quasi die Logik sein und ja, wie war die Frage?</w:t>
       </w:r>
     </w:p>
     <w:p/>
@@ -1186,12 +2391,44 @@
           <w:b/>
           <w:bCs/>
         </w:rPr>
-        <w:t>Torben Dörrer (Unverified)</w:t>
-      </w:r>
-    </w:p>
-    <w:p>
-      <w:r>
-        <w:t>Was die größten Bausteine sind, also wir haben jetzt schon im Prinzip bessere Explainability, also das Tool soll sich besser und genauer erklären, der Umgang mit den Specified-Merkmalen und auch allgemein Tabellen mit Platzhaltern eben.</w:t>
+        <w:t>Torben Dörrer (</w:t>
+      </w:r>
+      <w:proofErr w:type="spellStart"/>
+      <w:r>
+        <w:rPr>
+          <w:b/>
+          <w:bCs/>
+        </w:rPr>
+        <w:t>Unverified</w:t>
+      </w:r>
+      <w:proofErr w:type="spellEnd"/>
+      <w:r>
+        <w:rPr>
+          <w:b/>
+          <w:bCs/>
+        </w:rPr>
+        <w:t>)</w:t>
+      </w:r>
+    </w:p>
+    <w:p>
+      <w:r>
+        <w:t xml:space="preserve">Was die größten Bausteine sind, also wir haben jetzt schon im Prinzip bessere </w:t>
+      </w:r>
+      <w:proofErr w:type="spellStart"/>
+      <w:r>
+        <w:t>Explainability</w:t>
+      </w:r>
+      <w:proofErr w:type="spellEnd"/>
+      <w:r>
+        <w:t xml:space="preserve">, also das Tool soll sich besser und genauer erklären, der Umgang mit den </w:t>
+      </w:r>
+      <w:proofErr w:type="spellStart"/>
+      <w:r>
+        <w:t>Specified</w:t>
+      </w:r>
+      <w:proofErr w:type="spellEnd"/>
+      <w:r>
+        <w:t>-Merkmalen und auch allgemein Tabellen mit Platzhaltern eben.</w:t>
       </w:r>
     </w:p>
     <w:p>
@@ -1218,7 +2455,23 @@
           <w:b/>
           <w:bCs/>
         </w:rPr>
-        <w:t>Tobi Meyer (msg)</w:t>
+        <w:t>Tobi Meyer (</w:t>
+      </w:r>
+      <w:proofErr w:type="spellStart"/>
+      <w:r>
+        <w:rPr>
+          <w:b/>
+          <w:bCs/>
+        </w:rPr>
+        <w:t>msg</w:t>
+      </w:r>
+      <w:proofErr w:type="spellEnd"/>
+      <w:r>
+        <w:rPr>
+          <w:b/>
+          <w:bCs/>
+        </w:rPr>
+        <w:t>)</w:t>
       </w:r>
     </w:p>
     <w:p>
@@ -1228,17 +2481,41 @@
     </w:p>
     <w:p>
       <w:r>
-        <w:t>Er hat es halt jetzt in letzter Konsequenz noch nicht vollumfänglich richtig gemacht, weil es kann schon gut sein, wenn es jetzt, sagen wir, du hast ganz viele Werte und nur bei einem Wert spielt jetzt auf einmal ein Merkmal als Bedingung mit rein und bei allen anderen nicht.</w:t>
-      </w:r>
-    </w:p>
-    <w:p>
-      <w:r>
-        <w:t>Dann wäre es eigentlich schon cool, wenn er da eine zweite Tabelle macht, die dann nur diesen einen Sonderfall abdeckt und man muss halt sicherstellen, dass das dann im Zusammenspiel mit dem anderen noch funktioniert.</w:t>
-      </w:r>
-    </w:p>
-    <w:p>
-      <w:r>
-        <w:t>Also man muss dann, ja, was muss man machen? Eigentlich Constrain entsprechend einschränken, dass es nur läuft, wenn dieser Sonderfall eintritt.</w:t>
+        <w:t xml:space="preserve">Er hat es halt jetzt in letzter Konsequenz noch nicht vollumfänglich richtig gemacht, </w:t>
+      </w:r>
+      <w:proofErr w:type="gramStart"/>
+      <w:r>
+        <w:t>weil</w:t>
+      </w:r>
+      <w:proofErr w:type="gramEnd"/>
+      <w:r>
+        <w:t xml:space="preserve"> es kann schon gut sein, wenn es jetzt, sagen wir, du hast ganz viele Werte und nur bei einem Wert spielt jetzt auf einmal ein Merkmal als Bedingung mit rein und bei allen anderen nicht.</w:t>
+      </w:r>
+    </w:p>
+    <w:p>
+      <w:r>
+        <w:t xml:space="preserve">Dann wäre </w:t>
+      </w:r>
+      <w:proofErr w:type="gramStart"/>
+      <w:r>
+        <w:t>es eigentlich</w:t>
+      </w:r>
+      <w:proofErr w:type="gramEnd"/>
+      <w:r>
+        <w:t xml:space="preserve"> schon cool, wenn er da eine zweite Tabelle macht, die dann nur diesen einen Sonderfall abdeckt und man muss halt sicherstellen, dass das dann im Zusammenspiel mit dem anderen noch funktioniert.</w:t>
+      </w:r>
+    </w:p>
+    <w:p>
+      <w:r>
+        <w:t xml:space="preserve">Also man muss dann, ja, was muss man machen? Eigentlich </w:t>
+      </w:r>
+      <w:proofErr w:type="spellStart"/>
+      <w:r>
+        <w:t>Constrain</w:t>
+      </w:r>
+      <w:proofErr w:type="spellEnd"/>
+      <w:r>
+        <w:t xml:space="preserve"> entsprechend einschränken, dass es nur läuft, wenn dieser Sonderfall eintritt.</w:t>
       </w:r>
     </w:p>
     <w:p>
@@ -1248,7 +2525,15 @@
     </w:p>
     <w:p>
       <w:r>
-        <w:t>Dann können es eigentlich deckungsgleiche Bedingungen sein, die nur einmal von der einen Richtung geschrieben sind und einmal von der anderen.</w:t>
+        <w:t xml:space="preserve">Dann können </w:t>
+      </w:r>
+      <w:proofErr w:type="gramStart"/>
+      <w:r>
+        <w:t>es eigentlich</w:t>
+      </w:r>
+      <w:proofErr w:type="gramEnd"/>
+      <w:r>
+        <w:t xml:space="preserve"> deckungsgleiche Bedingungen sein, die nur einmal von der einen Richtung geschrieben sind und einmal von der anderen.</w:t>
       </w:r>
     </w:p>
     <w:p>
@@ -1258,12 +2543,49 @@
     </w:p>
     <w:p>
       <w:r>
-        <w:t>und und Wenn er das erkennen würde, dass hier eine Tabelle entstanden ist, die eigentlich der anderen entspricht oder eine Teilmenge der anderen ist, das wäre halt z.B.</w:t>
-      </w:r>
-    </w:p>
-    <w:p>
-      <w:r>
-        <w:t>echt stark, wenn sowas möglich wäre, zu analysen quasi. Und das dann natürlich auch zu erklären an der Stelle, wenn er das dann auch erkannt hat.</w:t>
+        <w:t xml:space="preserve">und </w:t>
+      </w:r>
+      <w:proofErr w:type="spellStart"/>
+      <w:r>
+        <w:t>und</w:t>
+      </w:r>
+      <w:proofErr w:type="spellEnd"/>
+      <w:r>
+        <w:t xml:space="preserve"> </w:t>
+      </w:r>
+      <w:proofErr w:type="spellStart"/>
+      <w:r>
+        <w:t>Wenn</w:t>
+      </w:r>
+      <w:proofErr w:type="spellEnd"/>
+      <w:r>
+        <w:t xml:space="preserve"> er </w:t>
+      </w:r>
+      <w:proofErr w:type="gramStart"/>
+      <w:r>
+        <w:t>das erkennen</w:t>
+      </w:r>
+      <w:proofErr w:type="gramEnd"/>
+      <w:r>
+        <w:t xml:space="preserve"> würde, dass hier eine Tabelle entstanden ist, die eigentlich der anderen entspricht oder eine Teilmenge der anderen ist, das wäre halt z.B.</w:t>
+      </w:r>
+    </w:p>
+    <w:p>
+      <w:r>
+        <w:t xml:space="preserve">echt stark, wenn sowas möglich wäre, zu </w:t>
+      </w:r>
+      <w:proofErr w:type="spellStart"/>
+      <w:proofErr w:type="gramStart"/>
+      <w:r>
+        <w:t>analysen</w:t>
+      </w:r>
+      <w:proofErr w:type="spellEnd"/>
+      <w:r>
+        <w:t xml:space="preserve"> quasi</w:t>
+      </w:r>
+      <w:proofErr w:type="gramEnd"/>
+      <w:r>
+        <w:t>. Und das dann natürlich auch zu erklären an der Stelle, wenn er das dann auch erkannt hat.</w:t>
       </w:r>
     </w:p>
     <w:p/>
@@ -1284,7 +2606,23 @@
           <w:b/>
           <w:bCs/>
         </w:rPr>
-        <w:t>Torben Dörrer (Unverified)</w:t>
+        <w:t>Torben Dörrer (</w:t>
+      </w:r>
+      <w:proofErr w:type="spellStart"/>
+      <w:r>
+        <w:rPr>
+          <w:b/>
+          <w:bCs/>
+        </w:rPr>
+        <w:t>Unverified</w:t>
+      </w:r>
+      <w:proofErr w:type="spellEnd"/>
+      <w:r>
+        <w:rPr>
+          <w:b/>
+          <w:bCs/>
+        </w:rPr>
+        <w:t>)</w:t>
       </w:r>
     </w:p>
     <w:p>
@@ -1295,7 +2633,15 @@
     <w:p>
       <w:r>
         <w:lastRenderedPageBreak/>
-        <w:t>Ja, okay. Ja, das waren soweit jetzt meine Fragen und das ganze Thema Evaluierung. Ich würde jetzt die Aufnahme beenden an der Stelle.</w:t>
+        <w:t xml:space="preserve">Ja, okay. Ja, das waren </w:t>
+      </w:r>
+      <w:proofErr w:type="gramStart"/>
+      <w:r>
+        <w:t>soweit</w:t>
+      </w:r>
+      <w:proofErr w:type="gramEnd"/>
+      <w:r>
+        <w:t xml:space="preserve"> jetzt meine Fragen und das ganze Thema Evaluierung. Ich würde jetzt die Aufnahme beenden an der Stelle.</w:t>
       </w:r>
     </w:p>
     <w:p>
@@ -1917,6 +3263,7 @@
   <w:style w:type="character" w:default="1" w:styleId="Absatz-Standardschriftart">
     <w:name w:val="Default Paragraph Font"/>
     <w:uiPriority w:val="1"/>
+    <w:semiHidden/>
     <w:unhideWhenUsed/>
   </w:style>
   <w:style w:type="table" w:default="1" w:styleId="NormaleTabelle">

</xml_diff>